<commit_message>
Before pro features migrations
</commit_message>
<xml_diff>
--- a/ERT-Appointment-Documentation-EN.docx
+++ b/ERT-Appointment-Documentation-EN.docx
@@ -17,7 +17,7 @@
           <w:sz w:val="60"/>
           <w:szCs w:val="60"/>
         </w:rPr>
-        <w:t xml:space="preserve">ERT SOFTWARE</w:t>
+        <w:t>ERT SOFTWARE</w:t>
       </w:r>
     </w:p>
     <w:p>
@@ -33,7 +33,7 @@
           <w:sz w:val="22"/>
           <w:szCs w:val="22"/>
         </w:rPr>
-        <w:t xml:space="preserve">www.ertyazilim.com</w:t>
+        <w:t>www.ertyazilim.com</w:t>
       </w:r>
     </w:p>
     <w:p>
@@ -50,7 +50,7 @@
           <w:sz w:val="60"/>
           <w:szCs w:val="60"/>
         </w:rPr>
-        <w:t xml:space="preserve">Appointment Booking by ERT</w:t>
+        <w:t>Appointment Booking by ERT</w:t>
       </w:r>
     </w:p>
     <w:p>
@@ -65,7 +65,7 @@
           <w:sz w:val="28"/>
           <w:szCs w:val="28"/>
         </w:rPr>
-        <w:t xml:space="preserve">User Guide &amp; Technical Reference</w:t>
+        <w:t>User Guide &amp; Technical Reference</w:t>
       </w:r>
     </w:p>
     <w:p>
@@ -80,7 +80,7 @@
           <w:sz w:val="22"/>
           <w:szCs w:val="22"/>
         </w:rPr>
-        <w:t xml:space="preserve">Version 1.0  ·  English  ·  2025</w:t>
+        <w:t>Version 1.0.1  ·  English  ·  2025</w:t>
       </w:r>
     </w:p>
     <w:tbl>
@@ -130,7 +130,7 @@
                 <w:sz w:val="20"/>
                 <w:szCs w:val="20"/>
               </w:rPr>
-              <w:t xml:space="preserve">Product</w:t>
+              <w:t>Product</w:t>
             </w:r>
           </w:p>
         </w:tc>
@@ -162,7 +162,7 @@
                 <w:sz w:val="20"/>
                 <w:szCs w:val="20"/>
               </w:rPr>
-              <w:t xml:space="preserve">Appointment Booking by ERT</w:t>
+              <w:t>Appointment Booking by ERT</w:t>
             </w:r>
           </w:p>
         </w:tc>
@@ -198,7 +198,7 @@
                 <w:sz w:val="20"/>
                 <w:szCs w:val="20"/>
               </w:rPr>
-              <w:t xml:space="preserve">Version</w:t>
+              <w:t>Version</w:t>
             </w:r>
           </w:p>
         </w:tc>
@@ -230,7 +230,7 @@
                 <w:sz w:val="20"/>
                 <w:szCs w:val="20"/>
               </w:rPr>
-              <w:t xml:space="preserve">1.0.0</w:t>
+              <w:t>1.0.1</w:t>
             </w:r>
           </w:p>
         </w:tc>
@@ -266,7 +266,7 @@
                 <w:sz w:val="20"/>
                 <w:szCs w:val="20"/>
               </w:rPr>
-              <w:t xml:space="preserve">Requirements</w:t>
+              <w:t>Requirements</w:t>
             </w:r>
           </w:p>
         </w:tc>
@@ -298,7 +298,7 @@
                 <w:sz w:val="20"/>
                 <w:szCs w:val="20"/>
               </w:rPr>
-              <w:t xml:space="preserve">WordPress 6.0+ · PHP 8.1+ · MySQL 5.7+</w:t>
+              <w:t>WordPress 6.2+ · PHP 8.1+ · MySQL 5.7+</w:t>
             </w:r>
           </w:p>
         </w:tc>
@@ -334,7 +334,7 @@
                 <w:sz w:val="20"/>
                 <w:szCs w:val="20"/>
               </w:rPr>
-              <w:t xml:space="preserve">Developer</w:t>
+              <w:t>Developer</w:t>
             </w:r>
           </w:p>
         </w:tc>
@@ -366,7 +366,7 @@
                 <w:sz w:val="20"/>
                 <w:szCs w:val="20"/>
               </w:rPr>
-              <w:t xml:space="preserve">ERT Software</w:t>
+              <w:t>ERT Software</w:t>
             </w:r>
           </w:p>
         </w:tc>
@@ -402,7 +402,7 @@
                 <w:sz w:val="20"/>
                 <w:szCs w:val="20"/>
               </w:rPr>
-              <w:t xml:space="preserve">Website</w:t>
+              <w:t>Website</w:t>
             </w:r>
           </w:p>
         </w:tc>
@@ -434,7 +434,7 @@
                 <w:sz w:val="20"/>
                 <w:szCs w:val="20"/>
               </w:rPr>
-              <w:t xml:space="preserve">www.ertyazilim.com</w:t>
+              <w:t>www.ertyazilim.com</w:t>
             </w:r>
           </w:p>
         </w:tc>
@@ -470,7 +470,7 @@
                 <w:sz w:val="20"/>
                 <w:szCs w:val="20"/>
               </w:rPr>
-              <w:t xml:space="preserve">Support</w:t>
+              <w:t>Support</w:t>
             </w:r>
           </w:p>
         </w:tc>
@@ -502,7 +502,7 @@
                 <w:sz w:val="20"/>
                 <w:szCs w:val="20"/>
               </w:rPr>
-              <w:t xml:space="preserve">support@ertyazilim.com</w:t>
+              <w:t>support@ertyazilim.com</w:t>
             </w:r>
           </w:p>
         </w:tc>
@@ -538,7 +538,7 @@
                 <w:sz w:val="20"/>
                 <w:szCs w:val="20"/>
               </w:rPr>
-              <w:t xml:space="preserve">Licence</w:t>
+              <w:t>Licence</w:t>
             </w:r>
           </w:p>
         </w:tc>
@@ -570,16 +570,14 @@
                 <w:sz w:val="20"/>
                 <w:szCs w:val="20"/>
               </w:rPr>
-              <w:t xml:space="preserve">GPL v2 (Lite)  ·  Proprietary (Pro)</w:t>
+              <w:t>GPL v2 (Lite)  ·  Proprietary (Pro)</w:t>
             </w:r>
           </w:p>
         </w:tc>
       </w:tr>
     </w:tbl>
     <w:p>
-      <w:r>
-        <w:br w:type="page"/>
-      </w:r>
+      <w:r/>
     </w:p>
     <w:p>
       <w:pPr>
@@ -647,7 +645,7 @@
           <w:sz w:val="44"/>
           <w:szCs w:val="44"/>
         </w:rPr>
-        <w:t xml:space="preserve">1.  Overview</w:t>
+        <w:t>1.  Overview</w:t>
       </w:r>
     </w:p>
     <w:p>
@@ -664,7 +662,7 @@
           <w:sz w:val="30"/>
           <w:szCs w:val="30"/>
         </w:rPr>
-        <w:t xml:space="preserve">1.1  About the Plugin</w:t>
+        <w:t>1.1  About the Plugin</w:t>
       </w:r>
     </w:p>
     <w:p>
@@ -678,7 +676,7 @@
           <w:sz w:val="22"/>
           <w:szCs w:val="22"/>
         </w:rPr>
-        <w:t xml:space="preserve">Appointment Booking by ERT is a comprehensive appointment and reservation management system built for WordPress service sites. It is designed for clinics, beauty salons, tutoring centres, consulting firms, sports facilities, and any other service-based business.</w:t>
+        <w:t>Appointment Booking by ERT is a comprehensive appointment and reservation management system built for WordPress service sites. It is designed for clinics, beauty salons, tutoring centres, consulting firms, sports facilities, and any other service-based business.</w:t>
       </w:r>
     </w:p>
     <w:p>
@@ -692,7 +690,7 @@
           <w:sz w:val="22"/>
           <w:szCs w:val="22"/>
         </w:rPr>
-        <w:t xml:space="preserve">The plugin is offered in two tiers:</w:t>
+        <w:t>The plugin is offered in two tiers:</w:t>
       </w:r>
     </w:p>
     <w:p>
@@ -711,7 +709,7 @@
           <w:sz w:val="22"/>
           <w:szCs w:val="22"/>
         </w:rPr>
-        <w:t xml:space="preserve">Lite (Free)  —  Includes all core booking features and is available on WordPress.org.</w:t>
+        <w:t>Lite (Free)  —  Includes all core booking features and is available on WordPress.org.</w:t>
       </w:r>
     </w:p>
     <w:p>
@@ -730,7 +728,7 @@
           <w:sz w:val="22"/>
           <w:szCs w:val="22"/>
         </w:rPr>
-        <w:t xml:space="preserve">Pro (Paid)  —  A separate add-on built on top of Lite. Adds Google Calendar, Zoom, online payments, and SMS notifications.</w:t>
+        <w:t>Pro (Paid)  —  A separate add-on built on top of Lite. Adds Google Calendar, Zoom, online payments, and SMS notifications.</w:t>
       </w:r>
     </w:p>
     <w:p>
@@ -747,7 +745,7 @@
           <w:sz w:val="30"/>
           <w:szCs w:val="30"/>
         </w:rPr>
-        <w:t xml:space="preserve">1.2  Core Features</w:t>
+        <w:t>1.2  Core Features</w:t>
       </w:r>
     </w:p>
     <w:tbl>
@@ -800,7 +798,7 @@
                 <w:sz w:val="20"/>
                 <w:szCs w:val="20"/>
               </w:rPr>
-              <w:t xml:space="preserve">Feature</w:t>
+              <w:t>Feature</w:t>
             </w:r>
           </w:p>
         </w:tc>
@@ -834,7 +832,7 @@
                 <w:sz w:val="20"/>
                 <w:szCs w:val="20"/>
               </w:rPr>
-              <w:t xml:space="preserve">Description</w:t>
+              <w:t>Description</w:t>
             </w:r>
           </w:p>
         </w:tc>
@@ -870,7 +868,7 @@
                 <w:sz w:val="20"/>
                 <w:szCs w:val="20"/>
               </w:rPr>
-              <w:t xml:space="preserve">Multi-Department</w:t>
+              <w:t>Multi-Department</w:t>
             </w:r>
           </w:p>
         </w:tc>
@@ -902,7 +900,7 @@
                 <w:sz w:val="20"/>
                 <w:szCs w:val="20"/>
               </w:rPr>
-              <w:t xml:space="preserve">Group providers into departments (clinic, team, studio)</w:t>
+              <w:t>Group providers into departments (clinic, team, studio)</w:t>
             </w:r>
           </w:p>
         </w:tc>
@@ -938,7 +936,7 @@
                 <w:sz w:val="20"/>
                 <w:szCs w:val="20"/>
               </w:rPr>
-              <w:t xml:space="preserve">Provider Management</w:t>
+              <w:t>Provider Management</w:t>
             </w:r>
           </w:p>
         </w:tc>
@@ -970,7 +968,7 @@
                 <w:sz w:val="20"/>
                 <w:szCs w:val="20"/>
               </w:rPr>
-              <w:t xml:space="preserve">Define individual working hours, breaks, and buffer times per provider</w:t>
+              <w:t>Define individual working hours, breaks, and buffer times per provider</w:t>
             </w:r>
           </w:p>
         </w:tc>
@@ -1006,7 +1004,7 @@
                 <w:sz w:val="20"/>
                 <w:szCs w:val="20"/>
               </w:rPr>
-              <w:t xml:space="preserve">Smart Slot Engine</w:t>
+              <w:t>Smart Slot Engine</w:t>
             </w:r>
           </w:p>
         </w:tc>
@@ -1038,7 +1036,7 @@
                 <w:sz w:val="20"/>
                 <w:szCs w:val="20"/>
               </w:rPr>
-              <w:t xml:space="preserve">Automatically generates available slots, respecting bookings, holidays, and special days</w:t>
+              <w:t>Automatically generates available slots, respecting bookings, holidays, and special days</w:t>
             </w:r>
           </w:p>
         </w:tc>
@@ -1074,7 +1072,7 @@
                 <w:sz w:val="20"/>
                 <w:szCs w:val="20"/>
               </w:rPr>
-              <w:t xml:space="preserve">Custom Forms</w:t>
+              <w:t>Custom Forms</w:t>
             </w:r>
           </w:p>
         </w:tc>
@@ -1106,7 +1104,7 @@
                 <w:sz w:val="20"/>
                 <w:szCs w:val="20"/>
               </w:rPr>
-              <w:t xml:space="preserve">Drag-and-drop form builder: text, email, phone, date, select, checkbox</w:t>
+              <w:t>Drag-and-drop form builder: text, email, phone, date, select, checkbox</w:t>
             </w:r>
           </w:p>
         </w:tc>
@@ -1142,7 +1140,7 @@
                 <w:sz w:val="20"/>
                 <w:szCs w:val="20"/>
               </w:rPr>
-              <w:t xml:space="preserve">Email Notifications</w:t>
+              <w:t>Notification Templates</w:t>
             </w:r>
           </w:p>
         </w:tc>
@@ -1174,7 +1172,7 @@
                 <w:sz w:val="20"/>
                 <w:szCs w:val="20"/>
               </w:rPr>
-              <w:t xml:space="preserve">Fully customisable templates for confirmations, cancellations, and reminders</w:t>
+              <w:t>Fully customisable templates for confirmations, cancellations, and reminders</w:t>
             </w:r>
           </w:p>
         </w:tc>
@@ -1210,7 +1208,7 @@
                 <w:sz w:val="20"/>
                 <w:szCs w:val="20"/>
               </w:rPr>
-              <w:t xml:space="preserve">REST API</w:t>
+              <w:t>REST API</w:t>
             </w:r>
           </w:p>
         </w:tc>
@@ -1242,7 +1240,7 @@
                 <w:sz w:val="20"/>
                 <w:szCs w:val="20"/>
               </w:rPr>
-              <w:t xml:space="preserve">Comprehensive JSON API for headless or third-party integrations</w:t>
+              <w:t>Comprehensive JSON API for headless or third-party integrations</w:t>
             </w:r>
           </w:p>
         </w:tc>
@@ -1278,7 +1276,7 @@
                 <w:sz w:val="20"/>
                 <w:szCs w:val="20"/>
               </w:rPr>
-              <w:t xml:space="preserve">Vue.js Admin</w:t>
+              <w:t>Vue.js Admin</w:t>
             </w:r>
           </w:p>
         </w:tc>
@@ -1310,7 +1308,7 @@
                 <w:sz w:val="20"/>
                 <w:szCs w:val="20"/>
               </w:rPr>
-              <w:t xml:space="preserve">Fast, intuitive single-page administration panel (SPA)</w:t>
+              <w:t>Fast, intuitive single-page administration panel (SPA)</w:t>
             </w:r>
           </w:p>
         </w:tc>
@@ -1346,7 +1344,7 @@
                 <w:sz w:val="20"/>
                 <w:szCs w:val="20"/>
               </w:rPr>
-              <w:t xml:space="preserve">Multilingual</w:t>
+              <w:t>Multilingual</w:t>
             </w:r>
           </w:p>
         </w:tc>
@@ -1378,7 +1376,7 @@
                 <w:sz w:val="20"/>
                 <w:szCs w:val="20"/>
               </w:rPr>
-              <w:t xml:space="preserve">Turkish, German, French, Spanish, Arabic, Russian — 160+ translation strings</w:t>
+              <w:t>Turkish, German, French, Spanish, Arabic, Russian — 160+ translation strings</w:t>
             </w:r>
           </w:p>
         </w:tc>
@@ -1414,7 +1412,7 @@
                 <w:sz w:val="20"/>
                 <w:szCs w:val="20"/>
               </w:rPr>
-              <w:t xml:space="preserve">Shortcode</w:t>
+              <w:t>Shortcode</w:t>
             </w:r>
           </w:p>
         </w:tc>
@@ -1446,7 +1444,7 @@
                 <w:sz w:val="20"/>
                 <w:szCs w:val="20"/>
               </w:rPr>
-              <w:t xml:space="preserve">Place the widget anywhere with [erta_booking]</w:t>
+              <w:t>Place the widget anywhere with [erta_booking]</w:t>
             </w:r>
           </w:p>
         </w:tc>
@@ -1482,7 +1480,7 @@
                 <w:sz w:val="20"/>
                 <w:szCs w:val="20"/>
               </w:rPr>
-              <w:t xml:space="preserve">Provider Portal</w:t>
+              <w:t>Provider Portal</w:t>
             </w:r>
           </w:p>
         </w:tc>
@@ -1514,7 +1512,7 @@
                 <w:sz w:val="20"/>
                 <w:szCs w:val="20"/>
               </w:rPr>
-              <w:t xml:space="preserve">Each provider can manage their own appointments independently</w:t>
+              <w:t>Each provider can manage their own appointments independently</w:t>
             </w:r>
           </w:p>
         </w:tc>
@@ -1534,7 +1532,7 @@
           <w:sz w:val="30"/>
           <w:szCs w:val="30"/>
         </w:rPr>
-        <w:t xml:space="preserve">1.3  System Requirements</w:t>
+        <w:t>1.3  System Requirements</w:t>
       </w:r>
     </w:p>
     <w:tbl>
@@ -1584,7 +1582,7 @@
                 <w:sz w:val="20"/>
                 <w:szCs w:val="20"/>
               </w:rPr>
-              <w:t xml:space="preserve">WordPress</w:t>
+              <w:t>WordPress</w:t>
             </w:r>
           </w:p>
         </w:tc>
@@ -1616,7 +1614,7 @@
                 <w:sz w:val="20"/>
                 <w:szCs w:val="20"/>
               </w:rPr>
-              <w:t xml:space="preserve">6.0 or higher</w:t>
+              <w:t>6.0 or higher</w:t>
             </w:r>
           </w:p>
         </w:tc>
@@ -1652,7 +1650,7 @@
                 <w:sz w:val="20"/>
                 <w:szCs w:val="20"/>
               </w:rPr>
-              <w:t xml:space="preserve">PHP</w:t>
+              <w:t>PHP</w:t>
             </w:r>
           </w:p>
         </w:tc>
@@ -1684,7 +1682,7 @@
                 <w:sz w:val="20"/>
                 <w:szCs w:val="20"/>
               </w:rPr>
-              <w:t xml:space="preserve">8.1 or higher</w:t>
+              <w:t>8.1 or higher</w:t>
             </w:r>
           </w:p>
         </w:tc>
@@ -1720,7 +1718,7 @@
                 <w:sz w:val="20"/>
                 <w:szCs w:val="20"/>
               </w:rPr>
-              <w:t xml:space="preserve">MySQL</w:t>
+              <w:t>MySQL</w:t>
             </w:r>
           </w:p>
         </w:tc>
@@ -1752,7 +1750,7 @@
                 <w:sz w:val="20"/>
                 <w:szCs w:val="20"/>
               </w:rPr>
-              <w:t xml:space="preserve">5.7+ or MariaDB 10.3+</w:t>
+              <w:t>5.7+ or MariaDB 10.3+</w:t>
             </w:r>
           </w:p>
         </w:tc>
@@ -1788,7 +1786,7 @@
                 <w:sz w:val="20"/>
                 <w:szCs w:val="20"/>
               </w:rPr>
-              <w:t xml:space="preserve">Browser</w:t>
+              <w:t>Browser</w:t>
             </w:r>
           </w:p>
         </w:tc>
@@ -1820,7 +1818,7 @@
                 <w:sz w:val="20"/>
                 <w:szCs w:val="20"/>
               </w:rPr>
-              <w:t xml:space="preserve">Chrome 90+, Firefox 88+, Safari 14+, Edge 90+</w:t>
+              <w:t>Chrome 90+, Firefox 88+, Safari 14+, Edge 90+</w:t>
             </w:r>
           </w:p>
         </w:tc>
@@ -1856,7 +1854,7 @@
                 <w:sz w:val="20"/>
                 <w:szCs w:val="20"/>
               </w:rPr>
-              <w:t xml:space="preserve">PHP Extensions</w:t>
+              <w:t>PHP Extensions</w:t>
             </w:r>
           </w:p>
         </w:tc>
@@ -1888,7 +1886,7 @@
                 <w:sz w:val="20"/>
                 <w:szCs w:val="20"/>
               </w:rPr>
-              <w:t xml:space="preserve">json, mbstring, openssl</w:t>
+              <w:t>json, mbstring, openssl</w:t>
             </w:r>
           </w:p>
         </w:tc>
@@ -1920,13 +1918,11 @@
           <w:sz w:val="21"/>
           <w:szCs w:val="21"/>
         </w:rPr>
-        <w:t xml:space="preserve">The Pro add-on requires the Lite plugin to be installed and active. Pro will not function without Lite.</w:t>
-      </w:r>
-    </w:p>
-    <w:p>
-      <w:r>
-        <w:br w:type="page"/>
-      </w:r>
+        <w:t>The Pro add-on requires the Lite plugin to be installed and active. Pro will not function without Lite.</w:t>
+      </w:r>
+    </w:p>
+    <w:p>
+      <w:r/>
     </w:p>
     <w:p>
       <w:pPr>
@@ -1994,7 +1990,7 @@
           <w:sz w:val="44"/>
           <w:szCs w:val="44"/>
         </w:rPr>
-        <w:t xml:space="preserve">2.  Installation</w:t>
+        <w:t>2.  Installation</w:t>
       </w:r>
     </w:p>
     <w:p>
@@ -2011,7 +2007,7 @@
           <w:sz w:val="30"/>
           <w:szCs w:val="30"/>
         </w:rPr>
-        <w:t xml:space="preserve">2.1  Installing the Lite Plugin</w:t>
+        <w:t>2.1  Installing the Lite Plugin</w:t>
       </w:r>
     </w:p>
     <w:p>
@@ -2028,7 +2024,7 @@
           <w:sz w:val="24"/>
           <w:szCs w:val="24"/>
         </w:rPr>
-        <w:t xml:space="preserve">Method A — WordPress Plugin Directory</w:t>
+        <w:t>Method A — WordPress Plugin Directory</w:t>
       </w:r>
     </w:p>
     <w:p>
@@ -2047,7 +2043,7 @@
           <w:sz w:val="22"/>
           <w:szCs w:val="22"/>
         </w:rPr>
-        <w:t xml:space="preserve">Log in to your WordPress administration panel</w:t>
+        <w:t>Log in to your WordPress administration panel</w:t>
       </w:r>
     </w:p>
     <w:p>
@@ -2066,7 +2062,7 @@
           <w:sz w:val="22"/>
           <w:szCs w:val="22"/>
         </w:rPr>
-        <w:t xml:space="preserve">Go to Plugins → Add New</w:t>
+        <w:t>Go to Plugins → Add New</w:t>
       </w:r>
     </w:p>
     <w:p>
@@ -2085,7 +2081,7 @@
           <w:sz w:val="22"/>
           <w:szCs w:val="22"/>
         </w:rPr>
-        <w:t xml:space="preserve">Search for "Appointment Booking by ERT"</w:t>
+        <w:t>Search for "Appointment Booking by ERT"</w:t>
       </w:r>
     </w:p>
     <w:p>
@@ -2104,7 +2100,7 @@
           <w:sz w:val="22"/>
           <w:szCs w:val="22"/>
         </w:rPr>
-        <w:t xml:space="preserve">Click "Install Now", then click "Activate"</w:t>
+        <w:t>Click "Install Now", then click "Activate"</w:t>
       </w:r>
     </w:p>
     <w:p>
@@ -2121,7 +2117,7 @@
           <w:sz w:val="24"/>
           <w:szCs w:val="24"/>
         </w:rPr>
-        <w:t xml:space="preserve">Method B — Manual Upload</w:t>
+        <w:t>Method B — Manual Upload</w:t>
       </w:r>
     </w:p>
     <w:p>
@@ -2140,7 +2136,7 @@
           <w:sz w:val="22"/>
           <w:szCs w:val="22"/>
         </w:rPr>
-        <w:t xml:space="preserve">Download ert-appointment.zip from wordpress.org or ertyazilim.com</w:t>
+        <w:t>Download ert-appointment.zip from wordpress.org or ertyazilim.com</w:t>
       </w:r>
     </w:p>
     <w:p>
@@ -2159,7 +2155,7 @@
           <w:sz w:val="22"/>
           <w:szCs w:val="22"/>
         </w:rPr>
-        <w:t xml:space="preserve">Go to Plugins → Add New → Upload Plugin</w:t>
+        <w:t>Go to Plugins → Add New → Upload Plugin</w:t>
       </w:r>
     </w:p>
     <w:p>
@@ -2178,7 +2174,7 @@
           <w:sz w:val="22"/>
           <w:szCs w:val="22"/>
         </w:rPr>
-        <w:t xml:space="preserve">Select the ZIP file and click "Install Now"</w:t>
+        <w:t>Select the ZIP file and click "Install Now"</w:t>
       </w:r>
     </w:p>
     <w:p>
@@ -2197,7 +2193,7 @@
           <w:sz w:val="22"/>
           <w:szCs w:val="22"/>
         </w:rPr>
-        <w:t xml:space="preserve">Click "Activate"</w:t>
+        <w:t>Click "Activate"</w:t>
       </w:r>
     </w:p>
     <w:p>
@@ -2226,7 +2222,7 @@
           <w:sz w:val="21"/>
           <w:szCs w:val="21"/>
         </w:rPr>
-        <w:t xml:space="preserve">After activation, database tables with the wp_erta_ prefix are created automatically — no SQL commands are required.</w:t>
+        <w:t>After activation, database tables with the wp_erta_ prefix are created automatically — no SQL commands are required.</w:t>
       </w:r>
     </w:p>
     <w:p>
@@ -2243,7 +2239,7 @@
           <w:sz w:val="30"/>
           <w:szCs w:val="30"/>
         </w:rPr>
-        <w:t xml:space="preserve">2.2  Installing the Pro Add-on</w:t>
+        <w:t>2.2  Installing the Pro Add-on</w:t>
       </w:r>
     </w:p>
     <w:p>
@@ -2272,7 +2268,7 @@
           <w:sz w:val="21"/>
           <w:szCs w:val="21"/>
         </w:rPr>
-        <w:t xml:space="preserve">Ensure the Lite plugin is active before installing the Pro add-on.</w:t>
+        <w:t>Ensure the Lite plugin is active before installing the Pro add-on.</w:t>
       </w:r>
     </w:p>
     <w:p>
@@ -2291,7 +2287,7 @@
           <w:sz w:val="22"/>
           <w:szCs w:val="22"/>
         </w:rPr>
-        <w:t xml:space="preserve">Purchase a Pro licence at ertyazilim.com</w:t>
+        <w:t>Purchase a Pro licence at ertyazilim.com</w:t>
       </w:r>
     </w:p>
     <w:p>
@@ -2310,7 +2306,7 @@
           <w:sz w:val="22"/>
           <w:szCs w:val="22"/>
         </w:rPr>
-        <w:t xml:space="preserve">Download ert-appointment-pro.zip from the purchase confirmation email</w:t>
+        <w:t>Download ert-appointment-pro.zip from the purchase confirmation email</w:t>
       </w:r>
     </w:p>
     <w:p>
@@ -2329,7 +2325,7 @@
           <w:sz w:val="22"/>
           <w:szCs w:val="22"/>
         </w:rPr>
-        <w:t xml:space="preserve">Go to Plugins → Add New → Upload Plugin and upload the ZIP file</w:t>
+        <w:t>Go to Plugins → Add New → Upload Plugin and upload the ZIP file</w:t>
       </w:r>
     </w:p>
     <w:p>
@@ -2348,7 +2344,7 @@
           <w:sz w:val="22"/>
           <w:szCs w:val="22"/>
         </w:rPr>
-        <w:t xml:space="preserve">Click "Activate"</w:t>
+        <w:t>Click "Activate"</w:t>
       </w:r>
     </w:p>
     <w:p>
@@ -2367,7 +2363,7 @@
           <w:sz w:val="22"/>
           <w:szCs w:val="22"/>
         </w:rPr>
-        <w:t xml:space="preserve">Navigate to ERT Appointment → Pro Licence</w:t>
+        <w:t>Navigate to ERT Appointment → Pro Licence</w:t>
       </w:r>
     </w:p>
     <w:p>
@@ -2386,7 +2382,7 @@
           <w:sz w:val="22"/>
           <w:szCs w:val="22"/>
         </w:rPr>
-        <w:t xml:space="preserve">Enter your licence key and click "Activate Licence"</w:t>
+        <w:t>Enter your licence key and click "Activate Licence"</w:t>
       </w:r>
     </w:p>
     <w:p>
@@ -2405,7 +2401,7 @@
           <w:sz w:val="22"/>
           <w:szCs w:val="22"/>
         </w:rPr>
-        <w:t xml:space="preserve">Pro features are instantly available upon successful activation</w:t>
+        <w:t>Pro features are instantly available upon successful activation</w:t>
       </w:r>
     </w:p>
     <w:p>
@@ -2422,7 +2418,7 @@
           <w:sz w:val="30"/>
           <w:szCs w:val="30"/>
         </w:rPr>
-        <w:t xml:space="preserve">2.3  Quick Start</w:t>
+        <w:t>2.3  Quick Start</w:t>
       </w:r>
     </w:p>
     <w:p>
@@ -2436,7 +2432,7 @@
           <w:sz w:val="22"/>
           <w:szCs w:val="22"/>
         </w:rPr>
-        <w:t xml:space="preserve">Follow these steps after installation to accept your first booking:</w:t>
+        <w:t>Follow these steps after installation to accept your first booking:</w:t>
       </w:r>
     </w:p>
     <w:p>
@@ -2455,7 +2451,7 @@
           <w:sz w:val="22"/>
           <w:szCs w:val="22"/>
         </w:rPr>
-        <w:t xml:space="preserve">ERT Appointment → Departments → Create a department (e.g. "General Consultation")</w:t>
+        <w:t>ERT Appointment → Departments → Create a department (e.g. "General Consultation")</w:t>
       </w:r>
     </w:p>
     <w:p>
@@ -2474,7 +2470,7 @@
           <w:sz w:val="22"/>
           <w:szCs w:val="22"/>
         </w:rPr>
-        <w:t xml:space="preserve">ERT Appointment → Providers → Create a provider and assign to the department</w:t>
+        <w:t>ERT Appointment → Providers → Create a provider and assign to the department</w:t>
       </w:r>
     </w:p>
     <w:p>
@@ -2493,7 +2489,7 @@
           <w:sz w:val="22"/>
           <w:szCs w:val="22"/>
         </w:rPr>
-        <w:t xml:space="preserve">ERT Appointment → Working Hours → Set the provider's working days and times</w:t>
+        <w:t>ERT Appointment → Working Hours → Set the provider's working days and times</w:t>
       </w:r>
     </w:p>
     <w:p>
@@ -2512,7 +2508,7 @@
           <w:sz w:val="22"/>
           <w:szCs w:val="22"/>
         </w:rPr>
-        <w:t xml:space="preserve">ERT Appointment → Forms → Review the default form or create a custom one</w:t>
+        <w:t>ERT Appointment → Forms → Review the default form or create a custom one</w:t>
       </w:r>
     </w:p>
     <w:p>
@@ -2531,7 +2527,7 @@
           <w:sz w:val="22"/>
           <w:szCs w:val="22"/>
         </w:rPr>
-        <w:t xml:space="preserve">ERT Appointment → Settings → Configure slot duration and confirmation mode</w:t>
+        <w:t>ERT Appointment → Settings → Configure slot duration and confirmation mode</w:t>
       </w:r>
     </w:p>
     <w:p>
@@ -2550,7 +2546,7 @@
           <w:sz w:val="22"/>
           <w:szCs w:val="22"/>
         </w:rPr>
-        <w:t xml:space="preserve">Create a WordPress page and add the [erta_booking] shortcode</w:t>
+        <w:t>Create a WordPress page and add the [erta_booking] shortcode</w:t>
       </w:r>
     </w:p>
     <w:p>
@@ -2569,7 +2565,7 @@
           <w:sz w:val="22"/>
           <w:szCs w:val="22"/>
         </w:rPr>
-        <w:t xml:space="preserve">Publish the page — your booking widget is live!</w:t>
+        <w:t>Publish the page — your booking widget is live!</w:t>
       </w:r>
     </w:p>
     <w:p>
@@ -2598,13 +2594,11 @@
           <w:sz w:val="21"/>
           <w:szCs w:val="21"/>
         </w:rPr>
-        <w:t xml:space="preserve">Add [erta_my_appointments] to any page to let logged-in customers view and manage their bookings.</w:t>
-      </w:r>
-    </w:p>
-    <w:p>
-      <w:r>
-        <w:br w:type="page"/>
-      </w:r>
+        <w:t>Add [erta_my_appointments] to any page to let logged-in customers view and manage their bookings.</w:t>
+      </w:r>
+    </w:p>
+    <w:p>
+      <w:r/>
     </w:p>
     <w:p>
       <w:pPr>
@@ -2672,7 +2666,7 @@
           <w:sz w:val="44"/>
           <w:szCs w:val="44"/>
         </w:rPr>
-        <w:t xml:space="preserve">3.  Department Management</w:t>
+        <w:t>3.  Department Management</w:t>
       </w:r>
     </w:p>
     <w:p>
@@ -2689,7 +2683,7 @@
           <w:sz w:val="30"/>
           <w:szCs w:val="30"/>
         </w:rPr>
-        <w:t xml:space="preserve">3.1  What is a Department?</w:t>
+        <w:t>3.1  What is a Department?</w:t>
       </w:r>
     </w:p>
     <w:p>
@@ -2703,7 +2697,7 @@
           <w:sz w:val="22"/>
           <w:szCs w:val="22"/>
         </w:rPr>
-        <w:t xml:space="preserve">Departments allow you to group providers and services into logical units. During booking, customers first select a department and then choose a provider within that department. Departments are optional — if only one exists, the selection step is skipped automatically.</w:t>
+        <w:t>Departments allow you to group providers and services into logical units. During booking, customers first select a department and then choose a provider within that department. Departments are optional — if only one exists, the selection step is skipped automatically.</w:t>
       </w:r>
     </w:p>
     <w:p>
@@ -2717,7 +2711,7 @@
           <w:sz w:val="22"/>
           <w:szCs w:val="22"/>
         </w:rPr>
-        <w:t xml:space="preserve">Common configurations:</w:t>
+        <w:t>Common configurations:</w:t>
       </w:r>
     </w:p>
     <w:p>
@@ -2736,7 +2730,7 @@
           <w:sz w:val="22"/>
           <w:szCs w:val="22"/>
         </w:rPr>
-        <w:t xml:space="preserve">Private clinic  →  General Practice · Dentistry · Ophthalmology · Orthopaedics</w:t>
+        <w:t>Private clinic  →  General Practice · Dentistry · Ophthalmology · Orthopaedics</w:t>
       </w:r>
     </w:p>
     <w:p>
@@ -2755,7 +2749,7 @@
           <w:sz w:val="22"/>
           <w:szCs w:val="22"/>
         </w:rPr>
-        <w:t xml:space="preserve">Sports facility  →  Swimming · Pilates · Fitness · Yoga</w:t>
+        <w:t>Sports facility  →  Swimming · Pilates · Fitness · Yoga</w:t>
       </w:r>
     </w:p>
     <w:p>
@@ -2774,7 +2768,7 @@
           <w:sz w:val="22"/>
           <w:szCs w:val="22"/>
         </w:rPr>
-        <w:t xml:space="preserve">Consultancy  →  Legal · Financial Advisory · Human Resources</w:t>
+        <w:t>Consultancy  →  Legal · Financial Advisory · Human Resources</w:t>
       </w:r>
     </w:p>
     <w:p>
@@ -2791,7 +2785,7 @@
           <w:sz w:val="30"/>
           <w:szCs w:val="30"/>
         </w:rPr>
-        <w:t xml:space="preserve">3.2  Creating a Department</w:t>
+        <w:t>3.2  Creating a Department</w:t>
       </w:r>
     </w:p>
     <w:p>
@@ -2810,7 +2804,7 @@
           <w:sz w:val="22"/>
           <w:szCs w:val="22"/>
         </w:rPr>
-        <w:t xml:space="preserve">Go to ERT Appointment → Departments</w:t>
+        <w:t>Go to ERT Appointment → Departments</w:t>
       </w:r>
     </w:p>
     <w:p>
@@ -2829,7 +2823,7 @@
           <w:sz w:val="22"/>
           <w:szCs w:val="22"/>
         </w:rPr>
-        <w:t xml:space="preserve">Click "New Department" in the top right</w:t>
+        <w:t>Click "New Department" in the top right</w:t>
       </w:r>
     </w:p>
     <w:p>
@@ -2848,7 +2842,7 @@
           <w:sz w:val="22"/>
           <w:szCs w:val="22"/>
         </w:rPr>
-        <w:t xml:space="preserve">Fill in the fields and save:</w:t>
+        <w:t>Fill in the fields and save:</w:t>
       </w:r>
     </w:p>
     <w:p>
@@ -2867,7 +2861,7 @@
           <w:sz w:val="22"/>
           <w:szCs w:val="22"/>
         </w:rPr>
-        <w:t xml:space="preserve">Name  —  The display name shown to customers</w:t>
+        <w:t>Name  —  The display name shown to customers</w:t>
       </w:r>
     </w:p>
     <w:p>
@@ -2886,7 +2880,7 @@
           <w:sz w:val="22"/>
           <w:szCs w:val="22"/>
         </w:rPr>
-        <w:t xml:space="preserve">Description  —  Optional, displayed during booking</w:t>
+        <w:t>Description  —  Optional, displayed during booking</w:t>
       </w:r>
     </w:p>
     <w:p>
@@ -2905,7 +2899,7 @@
           <w:sz w:val="22"/>
           <w:szCs w:val="22"/>
         </w:rPr>
-        <w:t xml:space="preserve">Order  —  Position in the listing</w:t>
+        <w:t>Order  —  Position in the listing</w:t>
       </w:r>
     </w:p>
     <w:p>
@@ -2924,7 +2918,7 @@
           <w:sz w:val="22"/>
           <w:szCs w:val="22"/>
         </w:rPr>
-        <w:t xml:space="preserve">Status  —  Active / Inactive</w:t>
+        <w:t>Status  —  Active / Inactive</w:t>
       </w:r>
     </w:p>
     <w:p>
@@ -2941,7 +2935,7 @@
           <w:sz w:val="30"/>
           <w:szCs w:val="30"/>
         </w:rPr>
-        <w:t xml:space="preserve">3.3  Department-Level Setting Overrides</w:t>
+        <w:t>3.3  Department-Level Setting Overrides</w:t>
       </w:r>
     </w:p>
     <w:p>
@@ -2955,7 +2949,7 @@
           <w:sz w:val="22"/>
           <w:szCs w:val="22"/>
         </w:rPr>
-        <w:t xml:space="preserve">Each department can independently override global settings, allowing different slot durations and approval flows per service type.</w:t>
+        <w:t>Each department can independently override global settings, allowing different slot durations and approval flows per service type.</w:t>
       </w:r>
     </w:p>
     <w:tbl>
@@ -3008,7 +3002,7 @@
                 <w:sz w:val="20"/>
                 <w:szCs w:val="20"/>
               </w:rPr>
-              <w:t xml:space="preserve">Setting</w:t>
+              <w:t>Setting</w:t>
             </w:r>
           </w:p>
         </w:tc>
@@ -3042,7 +3036,7 @@
                 <w:sz w:val="20"/>
                 <w:szCs w:val="20"/>
               </w:rPr>
-              <w:t xml:space="preserve">Description</w:t>
+              <w:t>Description</w:t>
             </w:r>
           </w:p>
         </w:tc>
@@ -3078,7 +3072,7 @@
                 <w:sz w:val="20"/>
                 <w:szCs w:val="20"/>
               </w:rPr>
-              <w:t xml:space="preserve">Slot Duration</w:t>
+              <w:t>Appointment Duration</w:t>
             </w:r>
           </w:p>
         </w:tc>
@@ -3110,7 +3104,7 @@
                 <w:sz w:val="20"/>
                 <w:szCs w:val="20"/>
               </w:rPr>
-              <w:t xml:space="preserve">Department-specific appointment length (min). Leave empty to inherit the global setting.</w:t>
+              <w:t>Department-specific appointment length (min). Leave empty to inherit the global setting.</w:t>
             </w:r>
           </w:p>
         </w:tc>
@@ -3146,7 +3140,7 @@
                 <w:sz w:val="20"/>
                 <w:szCs w:val="20"/>
               </w:rPr>
-              <w:t xml:space="preserve">Buffer Time</w:t>
+              <w:t>Buffer Time</w:t>
             </w:r>
           </w:p>
         </w:tc>
@@ -3178,7 +3172,7 @@
                 <w:sz w:val="20"/>
                 <w:szCs w:val="20"/>
               </w:rPr>
-              <w:t xml:space="preserve">Mandatory gap between consecutive appointments (min). Use for cleaning or preparation time.</w:t>
+              <w:t>Mandatory gap between consecutive appointments (min). Use for cleaning or preparation time.</w:t>
             </w:r>
           </w:p>
         </w:tc>
@@ -3214,7 +3208,7 @@
                 <w:sz w:val="20"/>
                 <w:szCs w:val="20"/>
               </w:rPr>
-              <w:t xml:space="preserve">Confirmation Mode</w:t>
+              <w:t>Confirmation Mode</w:t>
             </w:r>
           </w:p>
         </w:tc>
@@ -3246,7 +3240,7 @@
                 <w:sz w:val="20"/>
                 <w:szCs w:val="20"/>
               </w:rPr>
-              <w:t xml:space="preserve">"Automatic" → booking confirmed instantly.  "Manual" → waits for administrator approval.</w:t>
+              <w:t>"Automatic" → booking confirmed instantly.  "Manual" → waits for administrator approval.</w:t>
             </w:r>
           </w:p>
         </w:tc>
@@ -3282,7 +3276,7 @@
                 <w:sz w:val="20"/>
                 <w:szCs w:val="20"/>
               </w:rPr>
-              <w:t xml:space="preserve">Max Days Ahead</w:t>
+              <w:t>Max Days Ahead</w:t>
             </w:r>
           </w:p>
         </w:tc>
@@ -3314,7 +3308,7 @@
                 <w:sz w:val="20"/>
                 <w:szCs w:val="20"/>
               </w:rPr>
-              <w:t xml:space="preserve">How many days in advance customers are allowed to book.</w:t>
+              <w:t>How many days in advance customers are allowed to book.</w:t>
             </w:r>
           </w:p>
         </w:tc>
@@ -3350,7 +3344,7 @@
                 <w:sz w:val="20"/>
                 <w:szCs w:val="20"/>
               </w:rPr>
-              <w:t xml:space="preserve">Min Lead Time</w:t>
+              <w:t>Min Lead Time</w:t>
             </w:r>
           </w:p>
         </w:tc>
@@ -3382,16 +3376,14 @@
                 <w:sz w:val="20"/>
                 <w:szCs w:val="20"/>
               </w:rPr>
-              <w:t xml:space="preserve">Minimum hours before an appointment that a booking must be placed.</w:t>
+              <w:t>Minimum hours before an appointment that a booking must be placed.</w:t>
             </w:r>
           </w:p>
         </w:tc>
       </w:tr>
     </w:tbl>
     <w:p>
-      <w:r>
-        <w:br w:type="page"/>
-      </w:r>
+      <w:r/>
     </w:p>
     <w:p>
       <w:pPr>
@@ -3459,7 +3451,7 @@
           <w:sz w:val="44"/>
           <w:szCs w:val="44"/>
         </w:rPr>
-        <w:t xml:space="preserve">4.  Provider Management</w:t>
+        <w:t>4.  Provider Management</w:t>
       </w:r>
     </w:p>
     <w:p>
@@ -3476,7 +3468,7 @@
           <w:sz w:val="30"/>
           <w:szCs w:val="30"/>
         </w:rPr>
-        <w:t xml:space="preserve">4.1  What is a Provider?</w:t>
+        <w:t>4.1  What is a Provider?</w:t>
       </w:r>
     </w:p>
     <w:p>
@@ -3490,7 +3482,7 @@
           <w:sz w:val="22"/>
           <w:szCs w:val="22"/>
         </w:rPr>
-        <w:t xml:space="preserve">Providers are the people or resources that customers book appointments with. A provider can be a doctor, therapist, teacher, or a bookable resource such as a massage table or studio room. A single provider can be assigned to multiple departments simultaneously.</w:t>
+        <w:t>Providers are the people or resources that customers book appointments with. A provider can be a doctor, therapist, teacher, or a bookable resource such as a massage table or studio room. A single provider can be assigned to multiple departments simultaneously.</w:t>
       </w:r>
     </w:p>
     <w:p>
@@ -3507,7 +3499,7 @@
           <w:sz w:val="30"/>
           <w:szCs w:val="30"/>
         </w:rPr>
-        <w:t xml:space="preserve">4.2  Creating a Provider</w:t>
+        <w:t>4.2  Creating a Provider</w:t>
       </w:r>
     </w:p>
     <w:p>
@@ -3526,7 +3518,7 @@
           <w:sz w:val="22"/>
           <w:szCs w:val="22"/>
         </w:rPr>
-        <w:t xml:space="preserve">Go to ERT Appointment → Providers → New Provider</w:t>
+        <w:t>Go to ERT Appointment → Providers → New Provider</w:t>
       </w:r>
     </w:p>
     <w:p>
@@ -3545,7 +3537,7 @@
           <w:sz w:val="22"/>
           <w:szCs w:val="22"/>
         </w:rPr>
-        <w:t xml:space="preserve">Enter first name, last name, and email address</w:t>
+        <w:t>Enter first name, last name, and email address</w:t>
       </w:r>
     </w:p>
     <w:p>
@@ -3564,7 +3556,7 @@
           <w:sz w:val="22"/>
           <w:szCs w:val="22"/>
         </w:rPr>
-        <w:t xml:space="preserve">Select one or more departments to assign</w:t>
+        <w:t>Select one or more departments to assign</w:t>
       </w:r>
     </w:p>
     <w:p>
@@ -3583,7 +3575,7 @@
           <w:sz w:val="22"/>
           <w:szCs w:val="22"/>
         </w:rPr>
-        <w:t xml:space="preserve">Optionally link to a WordPress user account so the provider can access their own portal</w:t>
+        <w:t>Optionally link to a WordPress user account so the provider can access their own portal</w:t>
       </w:r>
     </w:p>
     <w:p>
@@ -3602,7 +3594,7 @@
           <w:sz w:val="22"/>
           <w:szCs w:val="22"/>
         </w:rPr>
-        <w:t xml:space="preserve">Upload a profile photo</w:t>
+        <w:t>Upload a profile photo</w:t>
       </w:r>
     </w:p>
     <w:p>
@@ -3621,7 +3613,7 @@
           <w:sz w:val="22"/>
           <w:szCs w:val="22"/>
         </w:rPr>
-        <w:t xml:space="preserve">Save</w:t>
+        <w:t>Save</w:t>
       </w:r>
     </w:p>
     <w:p>
@@ -3638,7 +3630,7 @@
           <w:sz w:val="30"/>
           <w:szCs w:val="30"/>
         </w:rPr>
-        <w:t xml:space="preserve">4.3  Working Hours and Priority Order</w:t>
+        <w:t>4.3  Working Hours and Priority Order</w:t>
       </w:r>
     </w:p>
     <w:p>
@@ -3652,7 +3644,7 @@
           <w:sz w:val="22"/>
           <w:szCs w:val="22"/>
         </w:rPr>
-        <w:t xml:space="preserve">Slot generation uses a three-tier override system:</w:t>
+        <w:t>Slot generation uses a three-tier override system:</w:t>
       </w:r>
     </w:p>
     <w:p>
@@ -3671,7 +3663,7 @@
           <w:sz w:val="22"/>
           <w:szCs w:val="22"/>
         </w:rPr>
-        <w:t xml:space="preserve">Global working hours  (lowest priority — system-wide default)</w:t>
+        <w:t>Global working hours  (lowest priority — system-wide default)</w:t>
       </w:r>
     </w:p>
     <w:p>
@@ -3690,7 +3682,7 @@
           <w:sz w:val="22"/>
           <w:szCs w:val="22"/>
         </w:rPr>
-        <w:t xml:space="preserve">Department working hours  (overrides global for the relevant department)</w:t>
+        <w:t>Department working hours  (overrides global for the relevant department)</w:t>
       </w:r>
     </w:p>
     <w:p>
@@ -3709,7 +3701,7 @@
           <w:sz w:val="22"/>
           <w:szCs w:val="22"/>
         </w:rPr>
-        <w:t xml:space="preserve">Provider working hours  (highest priority — overrides all settings above)</w:t>
+        <w:t>Provider working hours  (highest priority — overrides all settings above)</w:t>
       </w:r>
     </w:p>
     <w:p>
@@ -3723,7 +3715,7 @@
           <w:sz w:val="22"/>
           <w:szCs w:val="22"/>
         </w:rPr>
-        <w:t xml:space="preserve">For each day you can configure:</w:t>
+        <w:t>For each day you can configure:</w:t>
       </w:r>
     </w:p>
     <w:tbl>
@@ -3776,7 +3768,7 @@
                 <w:sz w:val="20"/>
                 <w:szCs w:val="20"/>
               </w:rPr>
-              <w:t xml:space="preserve">Field</w:t>
+              <w:t>Field</w:t>
             </w:r>
           </w:p>
         </w:tc>
@@ -3810,7 +3802,7 @@
                 <w:sz w:val="20"/>
                 <w:szCs w:val="20"/>
               </w:rPr>
-              <w:t xml:space="preserve">Description</w:t>
+              <w:t>Description</w:t>
             </w:r>
           </w:p>
         </w:tc>
@@ -3846,7 +3838,7 @@
                 <w:sz w:val="20"/>
                 <w:szCs w:val="20"/>
               </w:rPr>
-              <w:t xml:space="preserve">Active / Inactive</w:t>
+              <w:t>Active / Inactive</w:t>
             </w:r>
           </w:p>
         </w:tc>
@@ -3878,7 +3870,7 @@
                 <w:sz w:val="20"/>
                 <w:szCs w:val="20"/>
               </w:rPr>
-              <w:t xml:space="preserve">Whether the provider works on that day</w:t>
+              <w:t>Whether the provider works on that day</w:t>
             </w:r>
           </w:p>
         </w:tc>
@@ -3914,7 +3906,7 @@
                 <w:sz w:val="20"/>
                 <w:szCs w:val="20"/>
               </w:rPr>
-              <w:t xml:space="preserve">Start Time</w:t>
+              <w:t>Start Time</w:t>
             </w:r>
           </w:p>
         </w:tc>
@@ -3946,7 +3938,7 @@
                 <w:sz w:val="20"/>
                 <w:szCs w:val="20"/>
               </w:rPr>
-              <w:t xml:space="preserve">Working day start time (e.g. 09:00)</w:t>
+              <w:t>Working day start time (e.g. 09:00)</w:t>
             </w:r>
           </w:p>
         </w:tc>
@@ -3982,7 +3974,7 @@
                 <w:sz w:val="20"/>
                 <w:szCs w:val="20"/>
               </w:rPr>
-              <w:t xml:space="preserve">End Time</w:t>
+              <w:t>End Time</w:t>
             </w:r>
           </w:p>
         </w:tc>
@@ -4014,7 +4006,7 @@
                 <w:sz w:val="20"/>
                 <w:szCs w:val="20"/>
               </w:rPr>
-              <w:t xml:space="preserve">Working day end time (e.g. 18:00)</w:t>
+              <w:t>Working day end time (e.g. 18:00)</w:t>
             </w:r>
           </w:p>
         </w:tc>
@@ -4050,7 +4042,7 @@
                 <w:sz w:val="20"/>
                 <w:szCs w:val="20"/>
               </w:rPr>
-              <w:t xml:space="preserve">Break Periods</w:t>
+              <w:t>Break Periods</w:t>
             </w:r>
           </w:p>
         </w:tc>
@@ -4082,7 +4074,7 @@
                 <w:sz w:val="20"/>
                 <w:szCs w:val="20"/>
               </w:rPr>
-              <w:t xml:space="preserve">Multiple breaks can be defined; e.g. 12:00–13:00 and 15:30–15:45</w:t>
+              <w:t>Multiple breaks can be defined; e.g. 12:00–13:00 and 15:30–15:45</w:t>
             </w:r>
           </w:p>
         </w:tc>
@@ -4102,7 +4094,7 @@
           <w:sz w:val="30"/>
           <w:szCs w:val="30"/>
         </w:rPr>
-        <w:t xml:space="preserve">4.4  Special Days</w:t>
+        <w:t>4.4  Special Days</w:t>
       </w:r>
     </w:p>
     <w:p>
@@ -4116,7 +4108,7 @@
           <w:sz w:val="22"/>
           <w:szCs w:val="22"/>
         </w:rPr>
-        <w:t xml:space="preserve">Public holidays or days with non-standard hours can be designated as "Special Days". When a special day is defined for a date, the regular weekly schedule for that date is ignored entirely.</w:t>
+        <w:t>Public holidays or days with non-standard hours can be designated as "Special Days". When a special day is defined for a date, the regular weekly schedule for that date is ignored entirely.</w:t>
       </w:r>
     </w:p>
     <w:p>
@@ -4145,13 +4137,11 @@
           <w:sz w:val="21"/>
           <w:szCs w:val="21"/>
         </w:rPr>
-        <w:t xml:space="preserve">A special day set to "Closed" generates no slots for that date. A special day with custom hours generates slots only within those hours.</w:t>
-      </w:r>
-    </w:p>
-    <w:p>
-      <w:r>
-        <w:br w:type="page"/>
-      </w:r>
+        <w:t>A special day set to "Closed" generates no slots for that date. A special day with custom hours generates slots only within those hours.</w:t>
+      </w:r>
+    </w:p>
+    <w:p>
+      <w:r/>
     </w:p>
     <w:p>
       <w:pPr>
@@ -4219,7 +4209,7 @@
           <w:sz w:val="44"/>
           <w:szCs w:val="44"/>
         </w:rPr>
-        <w:t xml:space="preserve">5.  Booking Forms</w:t>
+        <w:t>5.  Booking Forms</w:t>
       </w:r>
     </w:p>
     <w:p>
@@ -4236,7 +4226,7 @@
           <w:sz w:val="30"/>
           <w:szCs w:val="30"/>
         </w:rPr>
-        <w:t xml:space="preserve">5.1  What is a Form?</w:t>
+        <w:t>5.1  What is a Form?</w:t>
       </w:r>
     </w:p>
     <w:p>
@@ -4250,7 +4240,7 @@
           <w:sz w:val="22"/>
           <w:szCs w:val="22"/>
         </w:rPr>
-        <w:t xml:space="preserve">Custom booking forms let you collect additional information from customers during the reservation process. Each form can be assigned to a department or provider and appears at a specific step in the booking flow.</w:t>
+        <w:t>Custom booking forms let you collect additional information from customers during the reservation process. Each form can be assigned to a department or provider and appears at a specific step in the booking flow.</w:t>
       </w:r>
     </w:p>
     <w:p>
@@ -4267,7 +4257,7 @@
           <w:sz w:val="30"/>
           <w:szCs w:val="30"/>
         </w:rPr>
-        <w:t xml:space="preserve">5.2  Supported Field Types</w:t>
+        <w:t>5.2  Supported Field Types</w:t>
       </w:r>
     </w:p>
     <w:tbl>
@@ -4320,7 +4310,7 @@
                 <w:sz w:val="20"/>
                 <w:szCs w:val="20"/>
               </w:rPr>
-              <w:t xml:space="preserve">Field Type</w:t>
+              <w:t>Field Type</w:t>
             </w:r>
           </w:p>
         </w:tc>
@@ -4354,7 +4344,7 @@
                 <w:sz w:val="20"/>
                 <w:szCs w:val="20"/>
               </w:rPr>
-              <w:t xml:space="preserve">Usage</w:t>
+              <w:t>Usage</w:t>
             </w:r>
           </w:p>
         </w:tc>
@@ -4390,7 +4380,7 @@
                 <w:sz w:val="20"/>
                 <w:szCs w:val="20"/>
               </w:rPr>
-              <w:t xml:space="preserve">Text</w:t>
+              <w:t>Text</w:t>
             </w:r>
           </w:p>
         </w:tc>
@@ -4422,7 +4412,7 @@
                 <w:sz w:val="20"/>
                 <w:szCs w:val="20"/>
               </w:rPr>
-              <w:t xml:space="preserve">Short single-line text. Example: "Chief Complaint / Notes"</w:t>
+              <w:t>Short single-line text. Example: "Chief Complaint / Notes"</w:t>
             </w:r>
           </w:p>
         </w:tc>
@@ -4458,7 +4448,7 @@
                 <w:sz w:val="20"/>
                 <w:szCs w:val="20"/>
               </w:rPr>
-              <w:t xml:space="preserve">Email</w:t>
+              <w:t>Email</w:t>
             </w:r>
           </w:p>
         </w:tc>
@@ -4490,7 +4480,7 @@
                 <w:sz w:val="20"/>
                 <w:szCs w:val="20"/>
               </w:rPr>
-              <w:t xml:space="preserve">Email address with format validation</w:t>
+              <w:t>Email address with format validation</w:t>
             </w:r>
           </w:p>
         </w:tc>
@@ -4526,7 +4516,7 @@
                 <w:sz w:val="20"/>
                 <w:szCs w:val="20"/>
               </w:rPr>
-              <w:t xml:space="preserve">Phone</w:t>
+              <w:t>Phone</w:t>
             </w:r>
           </w:p>
         </w:tc>
@@ -4558,7 +4548,7 @@
                 <w:sz w:val="20"/>
                 <w:szCs w:val="20"/>
               </w:rPr>
-              <w:t xml:space="preserve">Telephone number input</w:t>
+              <w:t>Telephone number input</w:t>
             </w:r>
           </w:p>
         </w:tc>
@@ -4594,7 +4584,7 @@
                 <w:sz w:val="20"/>
                 <w:szCs w:val="20"/>
               </w:rPr>
-              <w:t xml:space="preserve">Textarea</w:t>
+              <w:t>Textarea</w:t>
             </w:r>
           </w:p>
         </w:tc>
@@ -4626,7 +4616,7 @@
                 <w:sz w:val="20"/>
                 <w:szCs w:val="20"/>
               </w:rPr>
-              <w:t xml:space="preserve">Multi-line long-form text</w:t>
+              <w:t>Multi-line long-form text</w:t>
             </w:r>
           </w:p>
         </w:tc>
@@ -4662,7 +4652,7 @@
                 <w:sz w:val="20"/>
                 <w:szCs w:val="20"/>
               </w:rPr>
-              <w:t xml:space="preserve">Select</w:t>
+              <w:t>Select</w:t>
             </w:r>
           </w:p>
         </w:tc>
@@ -4694,7 +4684,7 @@
                 <w:sz w:val="20"/>
                 <w:szCs w:val="20"/>
               </w:rPr>
-              <w:t xml:space="preserve">Single-choice dropdown</w:t>
+              <w:t>Single-choice dropdown</w:t>
             </w:r>
           </w:p>
         </w:tc>
@@ -4730,7 +4720,7 @@
                 <w:sz w:val="20"/>
                 <w:szCs w:val="20"/>
               </w:rPr>
-              <w:t xml:space="preserve">Checkbox</w:t>
+              <w:t>Checkbox</w:t>
             </w:r>
           </w:p>
         </w:tc>
@@ -4762,7 +4752,7 @@
                 <w:sz w:val="20"/>
                 <w:szCs w:val="20"/>
               </w:rPr>
-              <w:t xml:space="preserve">Multi-choice — multiple options can be selected</w:t>
+              <w:t>Multi-choice — multiple options can be selected</w:t>
             </w:r>
           </w:p>
         </w:tc>
@@ -4798,7 +4788,7 @@
                 <w:sz w:val="20"/>
                 <w:szCs w:val="20"/>
               </w:rPr>
-              <w:t xml:space="preserve">Date</w:t>
+              <w:t>Date</w:t>
             </w:r>
           </w:p>
         </w:tc>
@@ -4830,7 +4820,7 @@
                 <w:sz w:val="20"/>
                 <w:szCs w:val="20"/>
               </w:rPr>
-              <w:t xml:space="preserve">Calendar-based date picker</w:t>
+              <w:t>Calendar-based date picker</w:t>
             </w:r>
           </w:p>
         </w:tc>
@@ -4866,7 +4856,7 @@
                 <w:sz w:val="20"/>
                 <w:szCs w:val="20"/>
               </w:rPr>
-              <w:t xml:space="preserve">Hidden</w:t>
+              <w:t>Hidden</w:t>
             </w:r>
           </w:p>
         </w:tc>
@@ -4898,7 +4888,7 @@
                 <w:sz w:val="20"/>
                 <w:szCs w:val="20"/>
               </w:rPr>
-              <w:t xml:space="preserve">Carries a fixed value silently; not visible to the customer</w:t>
+              <w:t>Carries a fixed value silently; not visible to the customer</w:t>
             </w:r>
           </w:p>
         </w:tc>
@@ -4918,7 +4908,7 @@
           <w:sz w:val="30"/>
           <w:szCs w:val="30"/>
         </w:rPr>
-        <w:t xml:space="preserve">5.3  Creating a Form</w:t>
+        <w:t>5.3  Creating a Form</w:t>
       </w:r>
     </w:p>
     <w:p>
@@ -4937,7 +4927,7 @@
           <w:sz w:val="22"/>
           <w:szCs w:val="22"/>
         </w:rPr>
-        <w:t xml:space="preserve">ERT Appointment → Forms → New Form</w:t>
+        <w:t>ERT Appointment → Forms → New Form</w:t>
       </w:r>
     </w:p>
     <w:p>
@@ -4956,7 +4946,7 @@
           <w:sz w:val="22"/>
           <w:szCs w:val="22"/>
         </w:rPr>
-        <w:t xml:space="preserve">Enter a form name</w:t>
+        <w:t>Enter a form name</w:t>
       </w:r>
     </w:p>
     <w:p>
@@ -4975,7 +4965,7 @@
           <w:sz w:val="22"/>
           <w:szCs w:val="22"/>
         </w:rPr>
-        <w:t xml:space="preserve">Add fields with the "Add Field" button</w:t>
+        <w:t>Add fields with the "Add Field" button</w:t>
       </w:r>
     </w:p>
     <w:p>
@@ -4994,7 +4984,7 @@
           <w:sz w:val="22"/>
           <w:szCs w:val="22"/>
         </w:rPr>
-        <w:t xml:space="preserve">Configure each field's label, required flag, and description</w:t>
+        <w:t>Configure each field's label, required flag, and description</w:t>
       </w:r>
     </w:p>
     <w:p>
@@ -5013,7 +5003,7 @@
           <w:sz w:val="22"/>
           <w:szCs w:val="22"/>
         </w:rPr>
-        <w:t xml:space="preserve">Reorder fields using drag-and-drop</w:t>
+        <w:t>Reorder fields using drag-and-drop</w:t>
       </w:r>
     </w:p>
     <w:p>
@@ -5032,13 +5022,11 @@
           <w:sz w:val="22"/>
           <w:szCs w:val="22"/>
         </w:rPr>
-        <w:t xml:space="preserve">Save and assign the form to a department</w:t>
-      </w:r>
-    </w:p>
-    <w:p>
-      <w:r>
-        <w:br w:type="page"/>
-      </w:r>
+        <w:t>Save and assign the form to a department</w:t>
+      </w:r>
+    </w:p>
+    <w:p>
+      <w:r/>
     </w:p>
     <w:p>
       <w:pPr>
@@ -5071,7 +5059,7 @@
           <w:sz w:val="52"/>
           <w:szCs w:val="52"/>
         </w:rPr>
-        <w:t xml:space="preserve">  Email Notifications</w:t>
+        <w:t xml:space="preserve">  Notification Templates</w:t>
       </w:r>
     </w:p>
     <w:p>
@@ -5106,7 +5094,7 @@
           <w:sz w:val="44"/>
           <w:szCs w:val="44"/>
         </w:rPr>
-        <w:t xml:space="preserve">6.  Email Notifications</w:t>
+        <w:t>6.  Notification Templates</w:t>
       </w:r>
     </w:p>
     <w:p>
@@ -5123,7 +5111,7 @@
           <w:sz w:val="30"/>
           <w:szCs w:val="30"/>
         </w:rPr>
-        <w:t xml:space="preserve">6.1  Notification Types</w:t>
+        <w:t>6.1  Notification Types</w:t>
       </w:r>
     </w:p>
     <w:tbl>
@@ -5176,7 +5164,7 @@
                 <w:sz w:val="20"/>
                 <w:szCs w:val="20"/>
               </w:rPr>
-              <w:t xml:space="preserve">Notification</w:t>
+              <w:t>Notification</w:t>
             </w:r>
           </w:p>
         </w:tc>
@@ -5210,7 +5198,7 @@
                 <w:sz w:val="20"/>
                 <w:szCs w:val="20"/>
               </w:rPr>
-              <w:t xml:space="preserve">Trigger</w:t>
+              <w:t>Trigger</w:t>
             </w:r>
           </w:p>
         </w:tc>
@@ -5246,7 +5234,7 @@
                 <w:sz w:val="20"/>
                 <w:szCs w:val="20"/>
               </w:rPr>
-              <w:t xml:space="preserve">Booking Confirmation (Customer)</w:t>
+              <w:t>Booking Confirmation (Customer)</w:t>
             </w:r>
           </w:p>
         </w:tc>
@@ -5278,7 +5266,7 @@
                 <w:sz w:val="20"/>
                 <w:szCs w:val="20"/>
               </w:rPr>
-              <w:t xml:space="preserve">Sent to the customer when a booking is created</w:t>
+              <w:t>Sent to the customer when a booking is created</w:t>
             </w:r>
           </w:p>
         </w:tc>
@@ -5314,7 +5302,7 @@
                 <w:sz w:val="20"/>
                 <w:szCs w:val="20"/>
               </w:rPr>
-              <w:t xml:space="preserve">New Booking (Admin)</w:t>
+              <w:t>New Booking (Admin)</w:t>
             </w:r>
           </w:p>
         </w:tc>
@@ -5346,7 +5334,7 @@
                 <w:sz w:val="20"/>
                 <w:szCs w:val="20"/>
               </w:rPr>
-              <w:t xml:space="preserve">Sent to admin or provider when a new booking is received</w:t>
+              <w:t>Sent to admin or provider when a new booking is received</w:t>
             </w:r>
           </w:p>
         </w:tc>
@@ -5382,7 +5370,7 @@
                 <w:sz w:val="20"/>
                 <w:szCs w:val="20"/>
               </w:rPr>
-              <w:t xml:space="preserve">Manual Approval (Customer)</w:t>
+              <w:t>Manual Approval (Customer)</w:t>
             </w:r>
           </w:p>
         </w:tc>
@@ -5414,7 +5402,7 @@
                 <w:sz w:val="20"/>
                 <w:szCs w:val="20"/>
               </w:rPr>
-              <w:t xml:space="preserve">Sent when an admin approves a booking in "Manual" mode</w:t>
+              <w:t>Sent when an admin approves a booking in "Manual" mode</w:t>
             </w:r>
           </w:p>
         </w:tc>
@@ -5450,7 +5438,7 @@
                 <w:sz w:val="20"/>
                 <w:szCs w:val="20"/>
               </w:rPr>
-              <w:t xml:space="preserve">Cancellation (Customer)</w:t>
+              <w:t>Cancellation (Customer)</w:t>
             </w:r>
           </w:p>
         </w:tc>
@@ -5482,7 +5470,7 @@
                 <w:sz w:val="20"/>
                 <w:szCs w:val="20"/>
               </w:rPr>
-              <w:t xml:space="preserve">Sent to the customer when a booking is cancelled</w:t>
+              <w:t>Sent to the customer when a booking is cancelled</w:t>
             </w:r>
           </w:p>
         </w:tc>
@@ -5518,7 +5506,7 @@
                 <w:sz w:val="20"/>
                 <w:szCs w:val="20"/>
               </w:rPr>
-              <w:t xml:space="preserve">Cancellation (Provider)</w:t>
+              <w:t>Cancellation (Provider)</w:t>
             </w:r>
           </w:p>
         </w:tc>
@@ -5550,7 +5538,7 @@
                 <w:sz w:val="20"/>
                 <w:szCs w:val="20"/>
               </w:rPr>
-              <w:t xml:space="preserve">Sent to the provider when a booking is cancelled</w:t>
+              <w:t>Sent to the provider when a booking is cancelled</w:t>
             </w:r>
           </w:p>
         </w:tc>
@@ -5586,7 +5574,7 @@
                 <w:sz w:val="20"/>
                 <w:szCs w:val="20"/>
               </w:rPr>
-              <w:t xml:space="preserve">Reschedule</w:t>
+              <w:t>Reschedule</w:t>
             </w:r>
           </w:p>
         </w:tc>
@@ -5618,7 +5606,7 @@
                 <w:sz w:val="20"/>
                 <w:szCs w:val="20"/>
               </w:rPr>
-              <w:t xml:space="preserve">Sent when an appointment date or time is changed</w:t>
+              <w:t>Sent when an appointment date or time is changed</w:t>
             </w:r>
           </w:p>
         </w:tc>
@@ -5654,7 +5642,7 @@
                 <w:sz w:val="20"/>
                 <w:szCs w:val="20"/>
               </w:rPr>
-              <w:t xml:space="preserve">Reminder</w:t>
+              <w:t>Reminder</w:t>
             </w:r>
           </w:p>
         </w:tc>
@@ -5686,7 +5674,7 @@
                 <w:sz w:val="20"/>
                 <w:szCs w:val="20"/>
               </w:rPr>
-              <w:t xml:space="preserve">Sent automatically a configured period before the appointment</w:t>
+              <w:t>Sent automatically a configured period before the appointment</w:t>
             </w:r>
           </w:p>
         </w:tc>
@@ -5706,7 +5694,7 @@
           <w:sz w:val="30"/>
           <w:szCs w:val="30"/>
         </w:rPr>
-        <w:t xml:space="preserve">6.2  Template Variables</w:t>
+        <w:t>6.2  Template Variables</w:t>
       </w:r>
     </w:p>
     <w:p>
@@ -5720,7 +5708,7 @@
           <w:sz w:val="22"/>
           <w:szCs w:val="22"/>
         </w:rPr>
-        <w:t xml:space="preserve">The following dynamic variables are available in notification templates:</w:t>
+        <w:t>The following dynamic variables are available in notification templates:</w:t>
       </w:r>
     </w:p>
     <w:tbl>
@@ -5773,7 +5761,7 @@
                 <w:sz w:val="20"/>
                 <w:szCs w:val="20"/>
               </w:rPr>
-              <w:t xml:space="preserve">Variable</w:t>
+              <w:t>Variable</w:t>
             </w:r>
           </w:p>
         </w:tc>
@@ -5807,7 +5795,7 @@
                 <w:sz w:val="20"/>
                 <w:szCs w:val="20"/>
               </w:rPr>
-              <w:t xml:space="preserve">Description</w:t>
+              <w:t>Description</w:t>
             </w:r>
           </w:p>
         </w:tc>
@@ -5843,7 +5831,7 @@
                 <w:sz w:val="20"/>
                 <w:szCs w:val="20"/>
               </w:rPr>
-              <w:t xml:space="preserve">{{customer_name}}</w:t>
+              <w:t>{{customer_name}}</w:t>
             </w:r>
           </w:p>
         </w:tc>
@@ -5875,7 +5863,7 @@
                 <w:sz w:val="20"/>
                 <w:szCs w:val="20"/>
               </w:rPr>
-              <w:t xml:space="preserve">Customer's full name</w:t>
+              <w:t>Customer's full name</w:t>
             </w:r>
           </w:p>
         </w:tc>
@@ -5911,7 +5899,7 @@
                 <w:sz w:val="20"/>
                 <w:szCs w:val="20"/>
               </w:rPr>
-              <w:t xml:space="preserve">{{customer_email}}</w:t>
+              <w:t>{{customer_email}}</w:t>
             </w:r>
           </w:p>
         </w:tc>
@@ -5943,7 +5931,7 @@
                 <w:sz w:val="20"/>
                 <w:szCs w:val="20"/>
               </w:rPr>
-              <w:t xml:space="preserve">Customer's email address</w:t>
+              <w:t>Customer's email address</w:t>
             </w:r>
           </w:p>
         </w:tc>
@@ -5979,7 +5967,7 @@
                 <w:sz w:val="20"/>
                 <w:szCs w:val="20"/>
               </w:rPr>
-              <w:t xml:space="preserve">{{customer_phone}}</w:t>
+              <w:t>{{customer_phone}}</w:t>
             </w:r>
           </w:p>
         </w:tc>
@@ -6011,7 +5999,7 @@
                 <w:sz w:val="20"/>
                 <w:szCs w:val="20"/>
               </w:rPr>
-              <w:t xml:space="preserve">Customer's phone number</w:t>
+              <w:t>Customer's phone number</w:t>
             </w:r>
           </w:p>
         </w:tc>
@@ -6047,7 +6035,7 @@
                 <w:sz w:val="20"/>
                 <w:szCs w:val="20"/>
               </w:rPr>
-              <w:t xml:space="preserve">{{appointment_date}}</w:t>
+              <w:t>{{appointment_date}}</w:t>
             </w:r>
           </w:p>
         </w:tc>
@@ -6079,7 +6067,7 @@
                 <w:sz w:val="20"/>
                 <w:szCs w:val="20"/>
               </w:rPr>
-              <w:t xml:space="preserve">Appointment date (e.g. 15 March 2025)</w:t>
+              <w:t>Appointment date (e.g. 15 March 2025)</w:t>
             </w:r>
           </w:p>
         </w:tc>
@@ -6115,7 +6103,7 @@
                 <w:sz w:val="20"/>
                 <w:szCs w:val="20"/>
               </w:rPr>
-              <w:t xml:space="preserve">{{appointment_time}}</w:t>
+              <w:t>{{appointment_time}}</w:t>
             </w:r>
           </w:p>
         </w:tc>
@@ -6147,7 +6135,7 @@
                 <w:sz w:val="20"/>
                 <w:szCs w:val="20"/>
               </w:rPr>
-              <w:t xml:space="preserve">Appointment time (e.g. 14:30)</w:t>
+              <w:t>Appointment time (e.g. 14:30)</w:t>
             </w:r>
           </w:p>
         </w:tc>
@@ -6183,7 +6171,7 @@
                 <w:sz w:val="20"/>
                 <w:szCs w:val="20"/>
               </w:rPr>
-              <w:t xml:space="preserve">{{appointment_id}}</w:t>
+              <w:t>{{appointment_id}}</w:t>
             </w:r>
           </w:p>
         </w:tc>
@@ -6215,7 +6203,7 @@
                 <w:sz w:val="20"/>
                 <w:szCs w:val="20"/>
               </w:rPr>
-              <w:t xml:space="preserve">Unique booking reference number</w:t>
+              <w:t>Unique booking reference number</w:t>
             </w:r>
           </w:p>
         </w:tc>
@@ -6251,7 +6239,7 @@
                 <w:sz w:val="20"/>
                 <w:szCs w:val="20"/>
               </w:rPr>
-              <w:t xml:space="preserve">{{provider_name}}</w:t>
+              <w:t>{{provider_name}}</w:t>
             </w:r>
           </w:p>
         </w:tc>
@@ -6283,7 +6271,7 @@
                 <w:sz w:val="20"/>
                 <w:szCs w:val="20"/>
               </w:rPr>
-              <w:t xml:space="preserve">Provider's full name</w:t>
+              <w:t>Provider's full name</w:t>
             </w:r>
           </w:p>
         </w:tc>
@@ -6319,7 +6307,7 @@
                 <w:sz w:val="20"/>
                 <w:szCs w:val="20"/>
               </w:rPr>
-              <w:t xml:space="preserve">{{department_name}}</w:t>
+              <w:t>{{department_name}}</w:t>
             </w:r>
           </w:p>
         </w:tc>
@@ -6351,7 +6339,7 @@
                 <w:sz w:val="20"/>
                 <w:szCs w:val="20"/>
               </w:rPr>
-              <w:t xml:space="preserve">Department name</w:t>
+              <w:t>Department name</w:t>
             </w:r>
           </w:p>
         </w:tc>
@@ -6387,7 +6375,7 @@
                 <w:sz w:val="20"/>
                 <w:szCs w:val="20"/>
               </w:rPr>
-              <w:t xml:space="preserve">{{cancel_url}}</w:t>
+              <w:t>{{cancel_url}}</w:t>
             </w:r>
           </w:p>
         </w:tc>
@@ -6419,7 +6407,7 @@
                 <w:sz w:val="20"/>
                 <w:szCs w:val="20"/>
               </w:rPr>
-              <w:t xml:space="preserve">One-click cancellation link for the customer</w:t>
+              <w:t>One-click cancellation link for the customer</w:t>
             </w:r>
           </w:p>
         </w:tc>
@@ -6455,7 +6443,7 @@
                 <w:sz w:val="20"/>
                 <w:szCs w:val="20"/>
               </w:rPr>
-              <w:t xml:space="preserve">{{reschedule_url}}</w:t>
+              <w:t>{{reschedule_url}}</w:t>
             </w:r>
           </w:p>
         </w:tc>
@@ -6487,7 +6475,7 @@
                 <w:sz w:val="20"/>
                 <w:szCs w:val="20"/>
               </w:rPr>
-              <w:t xml:space="preserve">Rescheduling link</w:t>
+              <w:t>Rescheduling link</w:t>
             </w:r>
           </w:p>
         </w:tc>
@@ -6523,7 +6511,7 @@
                 <w:sz w:val="20"/>
                 <w:szCs w:val="20"/>
               </w:rPr>
-              <w:t xml:space="preserve">{{site_name}}</w:t>
+              <w:t>{{site_name}}</w:t>
             </w:r>
           </w:p>
         </w:tc>
@@ -6555,7 +6543,7 @@
                 <w:sz w:val="20"/>
                 <w:szCs w:val="20"/>
               </w:rPr>
-              <w:t xml:space="preserve">WordPress site name</w:t>
+              <w:t>WordPress site name</w:t>
             </w:r>
           </w:p>
         </w:tc>
@@ -6591,7 +6579,7 @@
                 <w:sz w:val="20"/>
                 <w:szCs w:val="20"/>
               </w:rPr>
-              <w:t xml:space="preserve">{{site_url}}</w:t>
+              <w:t>{{site_url}}</w:t>
             </w:r>
           </w:p>
         </w:tc>
@@ -6623,7 +6611,7 @@
                 <w:sz w:val="20"/>
                 <w:szCs w:val="20"/>
               </w:rPr>
-              <w:t xml:space="preserve">WordPress site URL</w:t>
+              <w:t>WordPress site URL</w:t>
             </w:r>
           </w:p>
         </w:tc>
@@ -6655,13 +6643,11 @@
           <w:sz w:val="21"/>
           <w:szCs w:val="21"/>
         </w:rPr>
-        <w:t xml:space="preserve">For reliable email delivery we recommend pairing WordPress with the WP Mail SMTP plugin and an SMTP service such as Gmail, SendGrid, or Mailgun.</w:t>
-      </w:r>
-    </w:p>
-    <w:p>
-      <w:r>
-        <w:br w:type="page"/>
-      </w:r>
+        <w:t>For reliable email delivery we recommend pairing WordPress with the WP Mail SMTP plugin and an SMTP service such as Gmail, SendGrid, or Mailgun.</w:t>
+      </w:r>
+    </w:p>
+    <w:p>
+      <w:r/>
     </w:p>
     <w:p>
       <w:pPr>
@@ -6729,7 +6715,7 @@
           <w:sz w:val="44"/>
           <w:szCs w:val="44"/>
         </w:rPr>
-        <w:t xml:space="preserve">7.  Shortcodes &amp; Widget</w:t>
+        <w:t>7.  Shortcodes &amp; Widget</w:t>
       </w:r>
     </w:p>
     <w:p>
@@ -6746,7 +6732,7 @@
           <w:sz w:val="30"/>
           <w:szCs w:val="30"/>
         </w:rPr>
-        <w:t xml:space="preserve">7.1  [erta_booking]</w:t>
+        <w:t>7.1  [erta_booking]</w:t>
       </w:r>
     </w:p>
     <w:p>
@@ -6760,7 +6746,7 @@
           <w:sz w:val="22"/>
           <w:szCs w:val="22"/>
         </w:rPr>
-        <w:t xml:space="preserve">Add the booking widget to any page or post:</w:t>
+        <w:t>Add the booking widget to any page or post:</w:t>
       </w:r>
     </w:p>
     <w:p>
@@ -6775,7 +6761,7 @@
           <w:sz w:val="19"/>
           <w:szCs w:val="19"/>
         </w:rPr>
-        <w:t xml:space="preserve">[erta_booking]</w:t>
+        <w:t>[erta_booking]</w:t>
       </w:r>
     </w:p>
     <w:p>
@@ -6789,7 +6775,7 @@
           <w:sz w:val="22"/>
           <w:szCs w:val="22"/>
         </w:rPr>
-        <w:t xml:space="preserve">Optional parameters:</w:t>
+        <w:t>Optional parameters:</w:t>
       </w:r>
     </w:p>
     <w:tbl>
@@ -6842,7 +6828,7 @@
                 <w:sz w:val="20"/>
                 <w:szCs w:val="20"/>
               </w:rPr>
-              <w:t xml:space="preserve">Parameter</w:t>
+              <w:t>Parameter</w:t>
             </w:r>
           </w:p>
         </w:tc>
@@ -6876,7 +6862,7 @@
                 <w:sz w:val="20"/>
                 <w:szCs w:val="20"/>
               </w:rPr>
-              <w:t xml:space="preserve">Description</w:t>
+              <w:t>Description</w:t>
             </w:r>
           </w:p>
         </w:tc>
@@ -6912,7 +6898,7 @@
                 <w:sz w:val="20"/>
                 <w:szCs w:val="20"/>
               </w:rPr>
-              <w:t xml:space="preserve">department="ID"</w:t>
+              <w:t>department="ID"</w:t>
             </w:r>
           </w:p>
         </w:tc>
@@ -6944,7 +6930,7 @@
                 <w:sz w:val="20"/>
                 <w:szCs w:val="20"/>
               </w:rPr>
-              <w:t xml:space="preserve">Pre-selects a department and skips the department selection step</w:t>
+              <w:t>Pre-selects a department and skips the department selection step</w:t>
             </w:r>
           </w:p>
         </w:tc>
@@ -6980,7 +6966,7 @@
                 <w:sz w:val="20"/>
                 <w:szCs w:val="20"/>
               </w:rPr>
-              <w:t xml:space="preserve">provider="ID"</w:t>
+              <w:t>provider="ID"</w:t>
             </w:r>
           </w:p>
         </w:tc>
@@ -7012,7 +6998,7 @@
                 <w:sz w:val="20"/>
                 <w:szCs w:val="20"/>
               </w:rPr>
-              <w:t xml:space="preserve">Pre-selects a provider and skips the provider selection step</w:t>
+              <w:t>Pre-selects a provider and skips the provider selection step</w:t>
             </w:r>
           </w:p>
         </w:tc>
@@ -7048,7 +7034,7 @@
                 <w:sz w:val="20"/>
                 <w:szCs w:val="20"/>
               </w:rPr>
-              <w:t xml:space="preserve">hide_steps="..."</w:t>
+              <w:t>hide_steps="..."</w:t>
             </w:r>
           </w:p>
         </w:tc>
@@ -7080,7 +7066,7 @@
                 <w:sz w:val="20"/>
                 <w:szCs w:val="20"/>
               </w:rPr>
-              <w:t xml:space="preserve">Hides comma-separated steps. Example: hide_steps="department,provider"</w:t>
+              <w:t>Hides comma-separated steps. Example: hide_steps="department,provider"</w:t>
             </w:r>
           </w:p>
         </w:tc>
@@ -7112,7 +7098,7 @@
           <w:sz w:val="21"/>
           <w:szCs w:val="21"/>
         </w:rPr>
-        <w:t xml:space="preserve">Paste the shortcode into a Block Editor "Shortcode" block or directly into the Classic Editor HTML view.</w:t>
+        <w:t>Paste the shortcode into a Block Editor "Shortcode" block or directly into the Classic Editor HTML view.</w:t>
       </w:r>
     </w:p>
     <w:p>
@@ -7129,7 +7115,7 @@
           <w:sz w:val="30"/>
           <w:szCs w:val="30"/>
         </w:rPr>
-        <w:t xml:space="preserve">7.2  [erta_my_appointments]</w:t>
+        <w:t>7.2  [erta_my_appointments]</w:t>
       </w:r>
     </w:p>
     <w:p>
@@ -7143,7 +7129,7 @@
           <w:sz w:val="22"/>
           <w:szCs w:val="22"/>
         </w:rPr>
-        <w:t xml:space="preserve">Allows logged-in customers to view and manage their own bookings:</w:t>
+        <w:t>Allows logged-in customers to view and manage their own bookings:</w:t>
       </w:r>
     </w:p>
     <w:p>
@@ -7158,7 +7144,7 @@
           <w:sz w:val="19"/>
           <w:szCs w:val="19"/>
         </w:rPr>
-        <w:t xml:space="preserve">[erta_my_appointments]</w:t>
+        <w:t>[erta_my_appointments]</w:t>
       </w:r>
     </w:p>
     <w:p>
@@ -7187,7 +7173,7 @@
           <w:sz w:val="21"/>
           <w:szCs w:val="21"/>
         </w:rPr>
-        <w:t xml:space="preserve">This shortcode requires the visitor to be registered and logged in to WordPress.</w:t>
+        <w:t>This shortcode requires the visitor to be registered and logged in to WordPress.</w:t>
       </w:r>
     </w:p>
     <w:p>
@@ -7204,7 +7190,7 @@
           <w:sz w:val="30"/>
           <w:szCs w:val="30"/>
         </w:rPr>
-        <w:t xml:space="preserve">7.3  Default Booking Flow</w:t>
+        <w:t>7.3  Default Booking Flow</w:t>
       </w:r>
     </w:p>
     <w:p>
@@ -7223,7 +7209,7 @@
           <w:sz w:val="22"/>
           <w:szCs w:val="22"/>
         </w:rPr>
-        <w:t xml:space="preserve">Department selection</w:t>
+        <w:t>Department selection</w:t>
       </w:r>
     </w:p>
     <w:p>
@@ -7242,7 +7228,7 @@
           <w:sz w:val="22"/>
           <w:szCs w:val="22"/>
         </w:rPr>
-        <w:t xml:space="preserve">Provider selection</w:t>
+        <w:t>Provider selection</w:t>
       </w:r>
     </w:p>
     <w:p>
@@ -7261,7 +7247,7 @@
           <w:sz w:val="22"/>
           <w:szCs w:val="22"/>
         </w:rPr>
-        <w:t xml:space="preserve">Date selection from calendar</w:t>
+        <w:t>Date selection from calendar</w:t>
       </w:r>
     </w:p>
     <w:p>
@@ -7280,7 +7266,7 @@
           <w:sz w:val="22"/>
           <w:szCs w:val="22"/>
         </w:rPr>
-        <w:t xml:space="preserve">Available time slot selection</w:t>
+        <w:t>Available time slot selection</w:t>
       </w:r>
     </w:p>
     <w:p>
@@ -7299,7 +7285,7 @@
           <w:sz w:val="22"/>
           <w:szCs w:val="22"/>
         </w:rPr>
-        <w:t xml:space="preserve">Custom form completion (if configured)</w:t>
+        <w:t>Custom form completion (if configured)</w:t>
       </w:r>
     </w:p>
     <w:p>
@@ -7318,7 +7304,7 @@
           <w:sz w:val="22"/>
           <w:szCs w:val="22"/>
         </w:rPr>
-        <w:t xml:space="preserve">Confirmation screen / Payment (Pro)</w:t>
+        <w:t>Confirmation screen / Payment (Pro)</w:t>
       </w:r>
     </w:p>
     <w:p>
@@ -7337,7 +7323,7 @@
           <w:sz w:val="22"/>
           <w:szCs w:val="22"/>
         </w:rPr>
-        <w:t xml:space="preserve">Success message and email notification</w:t>
+        <w:t>Success message and email notification</w:t>
       </w:r>
     </w:p>
     <w:p>
@@ -7366,13 +7352,11 @@
           <w:sz w:val="21"/>
           <w:szCs w:val="21"/>
         </w:rPr>
-        <w:t xml:space="preserve">When the department or provider parameter is supplied to the shortcode, the corresponding step is skipped and the customer proceeds directly to the next step.</w:t>
-      </w:r>
-    </w:p>
-    <w:p>
-      <w:r>
-        <w:br w:type="page"/>
-      </w:r>
+        <w:t>When the department or provider parameter is supplied to the shortcode, the corresponding step is skipped and the customer proceeds directly to the next step.</w:t>
+      </w:r>
+    </w:p>
+    <w:p>
+      <w:r/>
     </w:p>
     <w:p>
       <w:pPr>
@@ -7440,7 +7424,7 @@
           <w:sz w:val="44"/>
           <w:szCs w:val="44"/>
         </w:rPr>
-        <w:t xml:space="preserve">8.  REST API</w:t>
+        <w:t>8.  REST API</w:t>
       </w:r>
     </w:p>
     <w:p>
@@ -7457,7 +7441,7 @@
           <w:sz w:val="30"/>
           <w:szCs w:val="30"/>
         </w:rPr>
-        <w:t xml:space="preserve">8.1  Basics</w:t>
+        <w:t>8.1  Basics</w:t>
       </w:r>
     </w:p>
     <w:tbl>
@@ -7507,7 +7491,7 @@
                 <w:sz w:val="20"/>
                 <w:szCs w:val="20"/>
               </w:rPr>
-              <w:t xml:space="preserve">Base URL</w:t>
+              <w:t>Base URL</w:t>
             </w:r>
           </w:p>
         </w:tc>
@@ -7539,7 +7523,7 @@
                 <w:sz w:val="20"/>
                 <w:szCs w:val="20"/>
               </w:rPr>
-              <w:t xml:space="preserve">https://yoursite.com/wp-json/erta/v1/</w:t>
+              <w:t>https://yoursite.com/wp-json/erta/v1/</w:t>
             </w:r>
           </w:p>
         </w:tc>
@@ -7575,7 +7559,7 @@
                 <w:sz w:val="20"/>
                 <w:szCs w:val="20"/>
               </w:rPr>
-              <w:t xml:space="preserve">Authentication</w:t>
+              <w:t>Authentication</w:t>
             </w:r>
           </w:p>
         </w:tc>
@@ -7607,7 +7591,7 @@
                 <w:sz w:val="20"/>
                 <w:szCs w:val="20"/>
               </w:rPr>
-              <w:t xml:space="preserve">WordPress Application Passwords or JWT</w:t>
+              <w:t>WordPress Application Passwords or JWT</w:t>
             </w:r>
           </w:p>
         </w:tc>
@@ -7643,7 +7627,7 @@
                 <w:sz w:val="20"/>
                 <w:szCs w:val="20"/>
               </w:rPr>
-              <w:t xml:space="preserve">Request Header</w:t>
+              <w:t>Request Header</w:t>
             </w:r>
           </w:p>
         </w:tc>
@@ -7675,7 +7659,7 @@
                 <w:sz w:val="20"/>
                 <w:szCs w:val="20"/>
               </w:rPr>
-              <w:t xml:space="preserve">Content-Type: application/json</w:t>
+              <w:t>Content-Type: application/json</w:t>
             </w:r>
           </w:p>
         </w:tc>
@@ -7711,7 +7695,7 @@
                 <w:sz w:val="20"/>
                 <w:szCs w:val="20"/>
               </w:rPr>
-              <w:t xml:space="preserve">Response Format</w:t>
+              <w:t>Response Format</w:t>
             </w:r>
           </w:p>
         </w:tc>
@@ -7743,7 +7727,7 @@
                 <w:sz w:val="20"/>
                 <w:szCs w:val="20"/>
               </w:rPr>
-              <w:t xml:space="preserve">JSON</w:t>
+              <w:t>JSON</w:t>
             </w:r>
           </w:p>
         </w:tc>
@@ -7779,7 +7763,7 @@
                 <w:sz w:val="20"/>
                 <w:szCs w:val="20"/>
               </w:rPr>
-              <w:t xml:space="preserve">HTTP Methods</w:t>
+              <w:t>HTTP Methods</w:t>
             </w:r>
           </w:p>
         </w:tc>
@@ -7811,7 +7795,7 @@
                 <w:sz w:val="20"/>
                 <w:szCs w:val="20"/>
               </w:rPr>
-              <w:t xml:space="preserve">GET, POST, PATCH, DELETE</w:t>
+              <w:t>GET, POST, PATCH, DELETE</w:t>
             </w:r>
           </w:p>
         </w:tc>
@@ -7831,7 +7815,7 @@
           <w:sz w:val="30"/>
           <w:szCs w:val="30"/>
         </w:rPr>
-        <w:t xml:space="preserve">8.2  Endpoint Reference</w:t>
+        <w:t>8.2  Endpoint Reference</w:t>
       </w:r>
     </w:p>
     <w:tbl>
@@ -7884,7 +7868,7 @@
                 <w:sz w:val="20"/>
                 <w:szCs w:val="20"/>
               </w:rPr>
-              <w:t xml:space="preserve">Endpoint</w:t>
+              <w:t>Endpoint</w:t>
             </w:r>
           </w:p>
         </w:tc>
@@ -7918,7 +7902,7 @@
                 <w:sz w:val="20"/>
                 <w:szCs w:val="20"/>
               </w:rPr>
-              <w:t xml:space="preserve">Description</w:t>
+              <w:t>Description</w:t>
             </w:r>
           </w:p>
         </w:tc>
@@ -7954,7 +7938,7 @@
                 <w:sz w:val="20"/>
                 <w:szCs w:val="20"/>
               </w:rPr>
-              <w:t xml:space="preserve">GET /departments</w:t>
+              <w:t>GET /departments</w:t>
             </w:r>
           </w:p>
         </w:tc>
@@ -7986,7 +7970,7 @@
                 <w:sz w:val="20"/>
                 <w:szCs w:val="20"/>
               </w:rPr>
-              <w:t xml:space="preserve">Returns a list of all active departments</w:t>
+              <w:t>Returns a list of all active departments</w:t>
             </w:r>
           </w:p>
         </w:tc>
@@ -8022,7 +8006,7 @@
                 <w:sz w:val="20"/>
                 <w:szCs w:val="20"/>
               </w:rPr>
-              <w:t xml:space="preserve">GET /providers</w:t>
+              <w:t>GET /providers</w:t>
             </w:r>
           </w:p>
         </w:tc>
@@ -8054,7 +8038,7 @@
                 <w:sz w:val="20"/>
                 <w:szCs w:val="20"/>
               </w:rPr>
-              <w:t xml:space="preserve">Lists providers; filter with ?department_id</w:t>
+              <w:t>Lists providers; filter with ?department_id</w:t>
             </w:r>
           </w:p>
         </w:tc>
@@ -8090,7 +8074,7 @@
                 <w:sz w:val="20"/>
                 <w:szCs w:val="20"/>
               </w:rPr>
-              <w:t xml:space="preserve">GET /availability</w:t>
+              <w:t>GET /availability</w:t>
             </w:r>
           </w:p>
         </w:tc>
@@ -8122,7 +8106,7 @@
                 <w:sz w:val="20"/>
                 <w:szCs w:val="20"/>
               </w:rPr>
-              <w:t xml:space="preserve">Returns available slots for a provider and date range</w:t>
+              <w:t>Returns available slots for a provider and date range</w:t>
             </w:r>
           </w:p>
         </w:tc>
@@ -8158,7 +8142,7 @@
                 <w:sz w:val="20"/>
                 <w:szCs w:val="20"/>
               </w:rPr>
-              <w:t xml:space="preserve">POST /appointments</w:t>
+              <w:t>POST /appointments</w:t>
             </w:r>
           </w:p>
         </w:tc>
@@ -8190,7 +8174,7 @@
                 <w:sz w:val="20"/>
                 <w:szCs w:val="20"/>
               </w:rPr>
-              <w:t xml:space="preserve">Creates a new booking</w:t>
+              <w:t>Creates a new booking</w:t>
             </w:r>
           </w:p>
         </w:tc>
@@ -8226,7 +8210,7 @@
                 <w:sz w:val="20"/>
                 <w:szCs w:val="20"/>
               </w:rPr>
-              <w:t xml:space="preserve">GET /appointments/{id}</w:t>
+              <w:t>GET /appointments/{id}</w:t>
             </w:r>
           </w:p>
         </w:tc>
@@ -8258,7 +8242,7 @@
                 <w:sz w:val="20"/>
                 <w:szCs w:val="20"/>
               </w:rPr>
-              <w:t xml:space="preserve">Returns the details of a single booking</w:t>
+              <w:t>Returns the details of a single booking</w:t>
             </w:r>
           </w:p>
         </w:tc>
@@ -8294,7 +8278,7 @@
                 <w:sz w:val="20"/>
                 <w:szCs w:val="20"/>
               </w:rPr>
-              <w:t xml:space="preserve">PATCH /appointments/{id}</w:t>
+              <w:t>PATCH /appointments/{id}</w:t>
             </w:r>
           </w:p>
         </w:tc>
@@ -8326,7 +8310,7 @@
                 <w:sz w:val="20"/>
                 <w:szCs w:val="20"/>
               </w:rPr>
-              <w:t xml:space="preserve">Updates a booking's status (admin)</w:t>
+              <w:t>Updates a booking's status (admin)</w:t>
             </w:r>
           </w:p>
         </w:tc>
@@ -8362,7 +8346,7 @@
                 <w:sz w:val="20"/>
                 <w:szCs w:val="20"/>
               </w:rPr>
-              <w:t xml:space="preserve">DELETE /appointments/{id}</w:t>
+              <w:t>DELETE /appointments/{id}</w:t>
             </w:r>
           </w:p>
         </w:tc>
@@ -8394,7 +8378,7 @@
                 <w:sz w:val="20"/>
                 <w:szCs w:val="20"/>
               </w:rPr>
-              <w:t xml:space="preserve">Cancels a booking</w:t>
+              <w:t>Cancels a booking</w:t>
             </w:r>
           </w:p>
         </w:tc>
@@ -8430,7 +8414,7 @@
                 <w:sz w:val="20"/>
                 <w:szCs w:val="20"/>
               </w:rPr>
-              <w:t xml:space="preserve">GET /working-hours</w:t>
+              <w:t>GET /working-hours</w:t>
             </w:r>
           </w:p>
         </w:tc>
@@ -8462,7 +8446,7 @@
                 <w:sz w:val="20"/>
                 <w:szCs w:val="20"/>
               </w:rPr>
-              <w:t xml:space="preserve">Returns the working hours configuration</w:t>
+              <w:t>Returns the working hours configuration</w:t>
             </w:r>
           </w:p>
         </w:tc>
@@ -8498,7 +8482,7 @@
                 <w:sz w:val="20"/>
                 <w:szCs w:val="20"/>
               </w:rPr>
-              <w:t xml:space="preserve">GET /forms/{id}</w:t>
+              <w:t>GET /forms/{id}</w:t>
             </w:r>
           </w:p>
         </w:tc>
@@ -8530,7 +8514,7 @@
                 <w:sz w:val="20"/>
                 <w:szCs w:val="20"/>
               </w:rPr>
-              <w:t xml:space="preserve">Returns a form's fields</w:t>
+              <w:t>Returns a form's fields</w:t>
             </w:r>
           </w:p>
         </w:tc>
@@ -8550,7 +8534,7 @@
           <w:sz w:val="30"/>
           <w:szCs w:val="30"/>
         </w:rPr>
-        <w:t xml:space="preserve">8.3  Example: Fetching Available Slots</w:t>
+        <w:t>8.3  Example: Fetching Available Slots</w:t>
       </w:r>
     </w:p>
     <w:p>
@@ -8565,7 +8549,7 @@
           <w:sz w:val="19"/>
           <w:szCs w:val="19"/>
         </w:rPr>
-        <w:t xml:space="preserve">GET /wp-json/erta/v1/availability</w:t>
+        <w:t>GET /wp-json/erta/v1/availability</w:t>
       </w:r>
     </w:p>
     <w:p>
@@ -8640,7 +8624,7 @@
           <w:sz w:val="19"/>
           <w:szCs w:val="19"/>
         </w:rPr>
-        <w:t xml:space="preserve">// Response</w:t>
+        <w:t>// Response</w:t>
       </w:r>
     </w:p>
     <w:p>
@@ -8655,7 +8639,7 @@
           <w:sz w:val="19"/>
           <w:szCs w:val="19"/>
         </w:rPr>
-        <w:t xml:space="preserve">{</w:t>
+        <w:t>{</w:t>
       </w:r>
     </w:p>
     <w:p>
@@ -8700,7 +8684,7 @@
           <w:sz w:val="19"/>
           <w:szCs w:val="19"/>
         </w:rPr>
-        <w:t xml:space="preserve">}</w:t>
+        <w:t>}</w:t>
       </w:r>
     </w:p>
     <w:p>
@@ -8717,7 +8701,7 @@
           <w:sz w:val="30"/>
           <w:szCs w:val="30"/>
         </w:rPr>
-        <w:t xml:space="preserve">8.4  Example: Creating a Booking</w:t>
+        <w:t>8.4  Example: Creating a Booking</w:t>
       </w:r>
     </w:p>
     <w:p>
@@ -8732,7 +8716,7 @@
           <w:sz w:val="19"/>
           <w:szCs w:val="19"/>
         </w:rPr>
-        <w:t xml:space="preserve">POST /wp-json/erta/v1/appointments</w:t>
+        <w:t>POST /wp-json/erta/v1/appointments</w:t>
       </w:r>
     </w:p>
     <w:p>
@@ -8747,7 +8731,7 @@
           <w:sz w:val="19"/>
           <w:szCs w:val="19"/>
         </w:rPr>
-        <w:t xml:space="preserve">{</w:t>
+        <w:t>{</w:t>
       </w:r>
     </w:p>
     <w:p>
@@ -8867,13 +8851,11 @@
           <w:sz w:val="19"/>
           <w:szCs w:val="19"/>
         </w:rPr>
-        <w:t xml:space="preserve">}</w:t>
-      </w:r>
-    </w:p>
-    <w:p>
-      <w:r>
-        <w:br w:type="page"/>
-      </w:r>
+        <w:t>}</w:t>
+      </w:r>
+    </w:p>
+    <w:p>
+      <w:r/>
     </w:p>
     <w:p>
       <w:pPr>
@@ -8941,7 +8923,7 @@
           <w:sz w:val="44"/>
           <w:szCs w:val="44"/>
         </w:rPr>
-        <w:t xml:space="preserve">9.  WordPress Hooks</w:t>
+        <w:t>9.  WordPress Hooks</w:t>
       </w:r>
     </w:p>
     <w:p>
@@ -8958,7 +8940,7 @@
           <w:sz w:val="30"/>
           <w:szCs w:val="30"/>
         </w:rPr>
-        <w:t xml:space="preserve">9.1  Action Hooks</w:t>
+        <w:t>9.1  Action Hooks</w:t>
       </w:r>
     </w:p>
     <w:tbl>
@@ -9012,7 +8994,7 @@
                 <w:sz w:val="20"/>
                 <w:szCs w:val="20"/>
               </w:rPr>
-              <w:t xml:space="preserve">Hook / Filter</w:t>
+              <w:t>Hook / Filter</w:t>
             </w:r>
           </w:p>
         </w:tc>
@@ -9046,7 +9028,7 @@
                 <w:sz w:val="20"/>
                 <w:szCs w:val="20"/>
               </w:rPr>
-              <w:t xml:space="preserve">Type</w:t>
+              <w:t>Type</w:t>
             </w:r>
           </w:p>
         </w:tc>
@@ -9080,7 +9062,7 @@
                 <w:sz w:val="20"/>
                 <w:szCs w:val="20"/>
               </w:rPr>
-              <w:t xml:space="preserve">Description</w:t>
+              <w:t>Description</w:t>
             </w:r>
           </w:p>
         </w:tc>
@@ -9114,7 +9096,7 @@
                 <w:sz w:val="19"/>
                 <w:szCs w:val="19"/>
               </w:rPr>
-              <w:t xml:space="preserve">erta_loaded</w:t>
+              <w:t>erta_loaded</w:t>
             </w:r>
           </w:p>
         </w:tc>
@@ -9148,7 +9130,7 @@
                 <w:sz w:val="19"/>
                 <w:szCs w:val="19"/>
               </w:rPr>
-              <w:t xml:space="preserve">Action</w:t>
+              <w:t>Action</w:t>
             </w:r>
           </w:p>
         </w:tc>
@@ -9180,7 +9162,7 @@
                 <w:sz w:val="19"/>
                 <w:szCs w:val="19"/>
               </w:rPr>
-              <w:t xml:space="preserve">Fires when the plugin is fully loaded and the DI container is ready</w:t>
+              <w:t>Fires when the plugin is fully loaded and the DI container is ready</w:t>
             </w:r>
           </w:p>
         </w:tc>
@@ -9214,7 +9196,7 @@
                 <w:sz w:val="19"/>
                 <w:szCs w:val="19"/>
               </w:rPr>
-              <w:t xml:space="preserve">erta_appointment_created</w:t>
+              <w:t>erta_appointment_created</w:t>
             </w:r>
           </w:p>
         </w:tc>
@@ -9248,7 +9230,7 @@
                 <w:sz w:val="19"/>
                 <w:szCs w:val="19"/>
               </w:rPr>
-              <w:t xml:space="preserve">Action</w:t>
+              <w:t>Action</w:t>
             </w:r>
           </w:p>
         </w:tc>
@@ -9280,7 +9262,7 @@
                 <w:sz w:val="19"/>
                 <w:szCs w:val="19"/>
               </w:rPr>
-              <w:t xml:space="preserve">Fires when a new booking is created. Parameter: Appointment object</w:t>
+              <w:t>Fires when a new booking is created. Parameter: Appointment object</w:t>
             </w:r>
           </w:p>
         </w:tc>
@@ -9314,7 +9296,7 @@
                 <w:sz w:val="19"/>
                 <w:szCs w:val="19"/>
               </w:rPr>
-              <w:t xml:space="preserve">erta_appointment_confirmed</w:t>
+              <w:t>erta_appointment_confirmed</w:t>
             </w:r>
           </w:p>
         </w:tc>
@@ -9348,7 +9330,7 @@
                 <w:sz w:val="19"/>
                 <w:szCs w:val="19"/>
               </w:rPr>
-              <w:t xml:space="preserve">Action</w:t>
+              <w:t>Action</w:t>
             </w:r>
           </w:p>
         </w:tc>
@@ -9380,7 +9362,7 @@
                 <w:sz w:val="19"/>
                 <w:szCs w:val="19"/>
               </w:rPr>
-              <w:t xml:space="preserve">Fires when a booking is confirmed. Parameter: Appointment object</w:t>
+              <w:t>Fires when a booking is confirmed. Parameter: Appointment object</w:t>
             </w:r>
           </w:p>
         </w:tc>
@@ -9414,7 +9396,7 @@
                 <w:sz w:val="19"/>
                 <w:szCs w:val="19"/>
               </w:rPr>
-              <w:t xml:space="preserve">erta_appointment_cancelled</w:t>
+              <w:t>erta_appointment_cancelled</w:t>
             </w:r>
           </w:p>
         </w:tc>
@@ -9448,7 +9430,7 @@
                 <w:sz w:val="19"/>
                 <w:szCs w:val="19"/>
               </w:rPr>
-              <w:t xml:space="preserve">Action</w:t>
+              <w:t>Action</w:t>
             </w:r>
           </w:p>
         </w:tc>
@@ -9480,7 +9462,7 @@
                 <w:sz w:val="19"/>
                 <w:szCs w:val="19"/>
               </w:rPr>
-              <w:t xml:space="preserve">Fires when a booking is cancelled. Parameter: Appointment object</w:t>
+              <w:t>Fires when a booking is cancelled. Parameter: Appointment object</w:t>
             </w:r>
           </w:p>
         </w:tc>
@@ -9514,7 +9496,7 @@
                 <w:sz w:val="19"/>
                 <w:szCs w:val="19"/>
               </w:rPr>
-              <w:t xml:space="preserve">erta_appointment_rescheduled</w:t>
+              <w:t>erta_appointment_rescheduled</w:t>
             </w:r>
           </w:p>
         </w:tc>
@@ -9548,7 +9530,7 @@
                 <w:sz w:val="19"/>
                 <w:szCs w:val="19"/>
               </w:rPr>
-              <w:t xml:space="preserve">Action</w:t>
+              <w:t>Action</w:t>
             </w:r>
           </w:p>
         </w:tc>
@@ -9580,7 +9562,7 @@
                 <w:sz w:val="19"/>
                 <w:szCs w:val="19"/>
               </w:rPr>
-              <w:t xml:space="preserve">Fires when rescheduled. Parameters: Appointment, old start time</w:t>
+              <w:t>Fires when rescheduled. Parameters: Appointment, old start time</w:t>
             </w:r>
           </w:p>
         </w:tc>
@@ -9614,7 +9596,7 @@
                 <w:sz w:val="19"/>
                 <w:szCs w:val="19"/>
               </w:rPr>
-              <w:t xml:space="preserve">erta_before_booking_saved</w:t>
+              <w:t>erta_before_booking_saved</w:t>
             </w:r>
           </w:p>
         </w:tc>
@@ -9648,7 +9630,7 @@
                 <w:sz w:val="19"/>
                 <w:szCs w:val="19"/>
               </w:rPr>
-              <w:t xml:space="preserve">Action</w:t>
+              <w:t>Action</w:t>
             </w:r>
           </w:p>
         </w:tc>
@@ -9680,7 +9662,7 @@
                 <w:sz w:val="19"/>
                 <w:szCs w:val="19"/>
               </w:rPr>
-              <w:t xml:space="preserve">Fires immediately before a booking is written to the database</w:t>
+              <w:t>Fires immediately before a booking is written to the database</w:t>
             </w:r>
           </w:p>
         </w:tc>
@@ -9714,7 +9696,7 @@
                 <w:sz w:val="19"/>
                 <w:szCs w:val="19"/>
               </w:rPr>
-              <w:t xml:space="preserve">erta_after_booking_saved</w:t>
+              <w:t>erta_after_booking_saved</w:t>
             </w:r>
           </w:p>
         </w:tc>
@@ -9748,7 +9730,7 @@
                 <w:sz w:val="19"/>
                 <w:szCs w:val="19"/>
               </w:rPr>
-              <w:t xml:space="preserve">Action</w:t>
+              <w:t>Action</w:t>
             </w:r>
           </w:p>
         </w:tc>
@@ -9780,7 +9762,7 @@
                 <w:sz w:val="19"/>
                 <w:szCs w:val="19"/>
               </w:rPr>
-              <w:t xml:space="preserve">Fires immediately after a booking is written to the database</w:t>
+              <w:t>Fires immediately after a booking is written to the database</w:t>
             </w:r>
           </w:p>
         </w:tc>
@@ -9800,7 +9782,7 @@
           <w:sz w:val="30"/>
           <w:szCs w:val="30"/>
         </w:rPr>
-        <w:t xml:space="preserve">9.2  Filter Hooks</w:t>
+        <w:t>9.2  Filter Hooks</w:t>
       </w:r>
     </w:p>
     <w:tbl>
@@ -9854,7 +9836,7 @@
                 <w:sz w:val="20"/>
                 <w:szCs w:val="20"/>
               </w:rPr>
-              <w:t xml:space="preserve">Hook / Filter</w:t>
+              <w:t>Hook / Filter</w:t>
             </w:r>
           </w:p>
         </w:tc>
@@ -9888,7 +9870,7 @@
                 <w:sz w:val="20"/>
                 <w:szCs w:val="20"/>
               </w:rPr>
-              <w:t xml:space="preserve">Type</w:t>
+              <w:t>Type</w:t>
             </w:r>
           </w:p>
         </w:tc>
@@ -9922,7 +9904,7 @@
                 <w:sz w:val="20"/>
                 <w:szCs w:val="20"/>
               </w:rPr>
-              <w:t xml:space="preserve">Description</w:t>
+              <w:t>Description</w:t>
             </w:r>
           </w:p>
         </w:tc>
@@ -9956,7 +9938,7 @@
                 <w:sz w:val="19"/>
                 <w:szCs w:val="19"/>
               </w:rPr>
-              <w:t xml:space="preserve">erta_is_pro_active</w:t>
+              <w:t>erta_is_pro_active</w:t>
             </w:r>
           </w:p>
         </w:tc>
@@ -9990,7 +9972,7 @@
                 <w:sz w:val="19"/>
                 <w:szCs w:val="19"/>
               </w:rPr>
-              <w:t xml:space="preserve">Filter</w:t>
+              <w:t>Filter</w:t>
             </w:r>
           </w:p>
         </w:tc>
@@ -10022,7 +10004,7 @@
                 <w:sz w:val="19"/>
                 <w:szCs w:val="19"/>
               </w:rPr>
-              <w:t xml:space="preserve">Returns whether the Pro add-on is active. Default: false</w:t>
+              <w:t>Returns whether the Pro add-on is active. Default: false</w:t>
             </w:r>
           </w:p>
         </w:tc>
@@ -10056,7 +10038,7 @@
                 <w:sz w:val="19"/>
                 <w:szCs w:val="19"/>
               </w:rPr>
-              <w:t xml:space="preserve">erta_slot_duration</w:t>
+              <w:t>erta_slot_duration</w:t>
             </w:r>
           </w:p>
         </w:tc>
@@ -10090,7 +10072,7 @@
                 <w:sz w:val="19"/>
                 <w:szCs w:val="19"/>
               </w:rPr>
-              <w:t xml:space="preserve">Filter</w:t>
+              <w:t>Filter</w:t>
             </w:r>
           </w:p>
         </w:tc>
@@ -10122,7 +10104,7 @@
                 <w:sz w:val="19"/>
                 <w:szCs w:val="19"/>
               </w:rPr>
-              <w:t xml:space="preserve">Customise slot length (min). Parameters: duration, provider_id</w:t>
+              <w:t>Customise slot length (min). Parameters: duration, provider_id</w:t>
             </w:r>
           </w:p>
         </w:tc>
@@ -10156,7 +10138,7 @@
                 <w:sz w:val="19"/>
                 <w:szCs w:val="19"/>
               </w:rPr>
-              <w:t xml:space="preserve">erta_available_slots</w:t>
+              <w:t>erta_available_slots</w:t>
             </w:r>
           </w:p>
         </w:tc>
@@ -10190,7 +10172,7 @@
                 <w:sz w:val="19"/>
                 <w:szCs w:val="19"/>
               </w:rPr>
-              <w:t xml:space="preserve">Filter</w:t>
+              <w:t>Filter</w:t>
             </w:r>
           </w:p>
         </w:tc>
@@ -10222,7 +10204,7 @@
                 <w:sz w:val="19"/>
                 <w:szCs w:val="19"/>
               </w:rPr>
-              <w:t xml:space="preserve">Modify the computed slot list. Parameters: slots, date, provider</w:t>
+              <w:t>Modify the computed slot list. Parameters: slots, date, provider</w:t>
             </w:r>
           </w:p>
         </w:tc>
@@ -10256,7 +10238,7 @@
                 <w:sz w:val="19"/>
                 <w:szCs w:val="19"/>
               </w:rPr>
-              <w:t xml:space="preserve">erta_notification_channels</w:t>
+              <w:t>erta_notification_channels</w:t>
             </w:r>
           </w:p>
         </w:tc>
@@ -10290,7 +10272,7 @@
                 <w:sz w:val="19"/>
                 <w:szCs w:val="19"/>
               </w:rPr>
-              <w:t xml:space="preserve">Filter</w:t>
+              <w:t>Filter</w:t>
             </w:r>
           </w:p>
         </w:tc>
@@ -10322,7 +10304,7 @@
                 <w:sz w:val="19"/>
                 <w:szCs w:val="19"/>
               </w:rPr>
-              <w:t xml:space="preserve">Extend notification channels (email, SMS, etc.)</w:t>
+              <w:t>Extend notification channels (email, SMS, etc.)</w:t>
             </w:r>
           </w:p>
         </w:tc>
@@ -10356,7 +10338,7 @@
                 <w:sz w:val="19"/>
                 <w:szCs w:val="19"/>
               </w:rPr>
-              <w:t xml:space="preserve">erta_email_headers</w:t>
+              <w:t>erta_email_headers</w:t>
             </w:r>
           </w:p>
         </w:tc>
@@ -10390,7 +10372,7 @@
                 <w:sz w:val="19"/>
                 <w:szCs w:val="19"/>
               </w:rPr>
-              <w:t xml:space="preserve">Filter</w:t>
+              <w:t>Filter</w:t>
             </w:r>
           </w:p>
         </w:tc>
@@ -10422,7 +10404,7 @@
                 <w:sz w:val="19"/>
                 <w:szCs w:val="19"/>
               </w:rPr>
-              <w:t xml:space="preserve">Customise email headers</w:t>
+              <w:t>Customise email headers</w:t>
             </w:r>
           </w:p>
         </w:tc>
@@ -10456,7 +10438,7 @@
                 <w:sz w:val="19"/>
                 <w:szCs w:val="19"/>
               </w:rPr>
-              <w:t xml:space="preserve">erta_booking_form_data</w:t>
+              <w:t>erta_booking_form_data</w:t>
             </w:r>
           </w:p>
         </w:tc>
@@ -10490,7 +10472,7 @@
                 <w:sz w:val="19"/>
                 <w:szCs w:val="19"/>
               </w:rPr>
-              <w:t xml:space="preserve">Filter</w:t>
+              <w:t>Filter</w:t>
             </w:r>
           </w:p>
         </w:tc>
@@ -10522,7 +10504,7 @@
                 <w:sz w:val="19"/>
                 <w:szCs w:val="19"/>
               </w:rPr>
-              <w:t xml:space="preserve">Validate or transform form data before saving</w:t>
+              <w:t>Validate or transform form data before saving</w:t>
             </w:r>
           </w:p>
         </w:tc>
@@ -10556,7 +10538,7 @@
                 <w:sz w:val="19"/>
                 <w:szCs w:val="19"/>
               </w:rPr>
-              <w:t xml:space="preserve">erta_appointment_status_label</w:t>
+              <w:t>erta_appointment_status_label</w:t>
             </w:r>
           </w:p>
         </w:tc>
@@ -10590,7 +10572,7 @@
                 <w:sz w:val="19"/>
                 <w:szCs w:val="19"/>
               </w:rPr>
-              <w:t xml:space="preserve">Filter</w:t>
+              <w:t>Filter</w:t>
             </w:r>
           </w:p>
         </w:tc>
@@ -10622,7 +10604,7 @@
                 <w:sz w:val="19"/>
                 <w:szCs w:val="19"/>
               </w:rPr>
-              <w:t xml:space="preserve">Customise appointment status label strings</w:t>
+              <w:t>Customise appointment status label strings</w:t>
             </w:r>
           </w:p>
         </w:tc>
@@ -10642,7 +10624,7 @@
           <w:sz w:val="30"/>
           <w:szCs w:val="30"/>
         </w:rPr>
-        <w:t xml:space="preserve">9.3  Code Examples</w:t>
+        <w:t>9.3  Code Examples</w:t>
       </w:r>
     </w:p>
     <w:p>
@@ -10656,7 +10638,7 @@
           <w:sz w:val="22"/>
           <w:szCs w:val="22"/>
         </w:rPr>
-        <w:t xml:space="preserve">Run custom logic when a booking is created:</w:t>
+        <w:t>Run custom logic when a booking is created:</w:t>
       </w:r>
     </w:p>
     <w:p>
@@ -10671,7 +10653,7 @@
           <w:sz w:val="19"/>
           <w:szCs w:val="19"/>
         </w:rPr>
-        <w:t xml:space="preserve">add_action( 'erta_appointment_created',</w:t>
+        <w:t>add_action( 'erta_appointment_created',</w:t>
       </w:r>
     </w:p>
     <w:p>
@@ -10746,7 +10728,7 @@
           <w:sz w:val="19"/>
           <w:szCs w:val="19"/>
         </w:rPr>
-        <w:t xml:space="preserve">);</w:t>
+        <w:t>);</w:t>
       </w:r>
     </w:p>
     <w:p>
@@ -10760,7 +10742,6 @@
           <w:sz w:val="22"/>
           <w:szCs w:val="22"/>
         </w:rPr>
-        <w:t xml:space="preserve"/>
       </w:r>
     </w:p>
     <w:p>
@@ -10774,7 +10755,7 @@
           <w:sz w:val="22"/>
           <w:szCs w:val="22"/>
         </w:rPr>
-        <w:t xml:space="preserve">Filter available slots for a specific provider:</w:t>
+        <w:t>Filter available slots for a specific provider:</w:t>
       </w:r>
     </w:p>
     <w:p>
@@ -10789,7 +10770,7 @@
           <w:sz w:val="19"/>
           <w:szCs w:val="19"/>
         </w:rPr>
-        <w:t xml:space="preserve">add_filter( 'erta_available_slots', function( array $slots, string $date, int $providerId ): array {</w:t>
+        <w:t>add_filter( 'erta_available_slots', function( array $slots, string $date, int $providerId ): array {</w:t>
       </w:r>
     </w:p>
     <w:p>
@@ -10849,13 +10830,11 @@
           <w:sz w:val="19"/>
           <w:szCs w:val="19"/>
         </w:rPr>
-        <w:t xml:space="preserve">}, 10, 3 );</w:t>
-      </w:r>
-    </w:p>
-    <w:p>
-      <w:r>
-        <w:br w:type="page"/>
-      </w:r>
+        <w:t>}, 10, 3 );</w:t>
+      </w:r>
+    </w:p>
+    <w:p>
+      <w:r/>
     </w:p>
     <w:p>
       <w:pPr>
@@ -10923,7 +10902,7 @@
           <w:sz w:val="44"/>
           <w:szCs w:val="44"/>
         </w:rPr>
-        <w:t xml:space="preserve">10.  FAQ &amp; Troubleshooting</w:t>
+        <w:t>10.  FAQ &amp; Troubleshooting</w:t>
       </w:r>
     </w:p>
     <w:p>
@@ -10940,7 +10919,7 @@
           <w:sz w:val="30"/>
           <w:szCs w:val="30"/>
         </w:rPr>
-        <w:t xml:space="preserve">10.1  Frequently Asked Questions</w:t>
+        <w:t>10.1  Frequently Asked Questions</w:t>
       </w:r>
     </w:p>
     <w:p>
@@ -10957,7 +10936,7 @@
           <w:sz w:val="24"/>
           <w:szCs w:val="24"/>
         </w:rPr>
-        <w:t xml:space="preserve">Q: The booking widget is not showing on my page.</w:t>
+        <w:t>Q: The booking widget is not showing on my page.</w:t>
       </w:r>
     </w:p>
     <w:p>
@@ -10976,7 +10955,7 @@
           <w:sz w:val="22"/>
           <w:szCs w:val="22"/>
         </w:rPr>
-        <w:t xml:space="preserve">Confirm the [erta_booking] shortcode is present in the page content</w:t>
+        <w:t>Confirm the [erta_booking] shortcode is present in the page content</w:t>
       </w:r>
     </w:p>
     <w:p>
@@ -10995,7 +10974,7 @@
           <w:sz w:val="22"/>
           <w:szCs w:val="22"/>
         </w:rPr>
-        <w:t xml:space="preserve">Verify the plugin shows as "Active" in Plugins → Installed Plugins</w:t>
+        <w:t>Verify the plugin shows as "Active" in Plugins → Installed Plugins</w:t>
       </w:r>
     </w:p>
     <w:p>
@@ -11014,7 +10993,7 @@
           <w:sz w:val="22"/>
           <w:szCs w:val="22"/>
         </w:rPr>
-        <w:t xml:space="preserve">At least one active department with one active provider assigned to it is required</w:t>
+        <w:t>At least one active department with one active provider assigned to it is required</w:t>
       </w:r>
     </w:p>
     <w:p>
@@ -11033,7 +11012,7 @@
           <w:sz w:val="22"/>
           <w:szCs w:val="22"/>
         </w:rPr>
-        <w:t xml:space="preserve">The provider must have working hours configured</w:t>
+        <w:t>The provider must have working hours configured</w:t>
       </w:r>
     </w:p>
     <w:p>
@@ -11052,7 +11031,7 @@
           <w:sz w:val="22"/>
           <w:szCs w:val="22"/>
         </w:rPr>
-        <w:t xml:space="preserve">Ensure the requested date is not marked as "Special Day — Closed"</w:t>
+        <w:t>Ensure the requested date is not marked as "Special Day — Closed"</w:t>
       </w:r>
     </w:p>
     <w:p>
@@ -11069,7 +11048,7 @@
           <w:sz w:val="24"/>
           <w:szCs w:val="24"/>
         </w:rPr>
-        <w:t xml:space="preserve">Q: Emails are not being delivered.</w:t>
+        <w:t>Q: Emails are not being delivered.</w:t>
       </w:r>
     </w:p>
     <w:p>
@@ -11083,7 +11062,7 @@
           <w:sz w:val="22"/>
           <w:szCs w:val="22"/>
         </w:rPr>
-        <w:t xml:space="preserve">WordPress's default PHP mail() function is unreliable on most shared hosting. Use a dedicated SMTP service:</w:t>
+        <w:t>WordPress's default PHP mail() function is unreliable on most shared hosting. Use a dedicated SMTP service:</w:t>
       </w:r>
     </w:p>
     <w:p>
@@ -11102,7 +11081,7 @@
           <w:sz w:val="22"/>
           <w:szCs w:val="22"/>
         </w:rPr>
-        <w:t xml:space="preserve">Install the WP Mail SMTP plugin</w:t>
+        <w:t>Install the WP Mail SMTP plugin</w:t>
       </w:r>
     </w:p>
     <w:p>
@@ -11121,7 +11100,7 @@
           <w:sz w:val="22"/>
           <w:szCs w:val="22"/>
         </w:rPr>
-        <w:t xml:space="preserve">Configure with Gmail (OAuth), SendGrid API, or Mailgun SMTP</w:t>
+        <w:t>Configure with Gmail (OAuth), SendGrid API, or Mailgun SMTP</w:t>
       </w:r>
     </w:p>
     <w:p>
@@ -11140,7 +11119,7 @@
           <w:sz w:val="22"/>
           <w:szCs w:val="22"/>
         </w:rPr>
-        <w:t xml:space="preserve">Send a test email from the settings page to confirm delivery</w:t>
+        <w:t>Send a test email from the settings page to confirm delivery</w:t>
       </w:r>
     </w:p>
     <w:p>
@@ -11157,7 +11136,7 @@
           <w:sz w:val="24"/>
           <w:szCs w:val="24"/>
         </w:rPr>
-        <w:t xml:space="preserve">Q: No time slots are appearing.</w:t>
+        <w:t>Q: No time slots are appearing.</w:t>
       </w:r>
     </w:p>
     <w:p>
@@ -11176,7 +11155,7 @@
           <w:sz w:val="22"/>
           <w:szCs w:val="22"/>
         </w:rPr>
-        <w:t xml:space="preserve">Has a working schedule been defined for the provider on the relevant day?</w:t>
+        <w:t>Has a working schedule been defined for the provider on the relevant day?</w:t>
       </w:r>
     </w:p>
     <w:p>
@@ -11195,7 +11174,7 @@
           <w:sz w:val="22"/>
           <w:szCs w:val="22"/>
         </w:rPr>
-        <w:t xml:space="preserve">Is the slot duration small enough to fit within the working hours window?</w:t>
+        <w:t>Is the slot duration small enough to fit within the working hours window?</w:t>
       </w:r>
     </w:p>
     <w:p>
@@ -11214,7 +11193,7 @@
           <w:sz w:val="22"/>
           <w:szCs w:val="22"/>
         </w:rPr>
-        <w:t xml:space="preserve">Is the "Min Lead Time" setting overly restrictive (e.g. 72 hours)?</w:t>
+        <w:t>Is the "Min Lead Time" setting overly restrictive (e.g. 72 hours)?</w:t>
       </w:r>
     </w:p>
     <w:p>
@@ -11233,7 +11212,7 @@
           <w:sz w:val="22"/>
           <w:szCs w:val="22"/>
         </w:rPr>
-        <w:t xml:space="preserve">Are all slots already booked for that day?</w:t>
+        <w:t>Are all slots already booked for that day?</w:t>
       </w:r>
     </w:p>
     <w:p>
@@ -11250,7 +11229,7 @@
           <w:sz w:val="24"/>
           <w:szCs w:val="24"/>
         </w:rPr>
-        <w:t xml:space="preserve">Q: Can I transfer my Pro licence to a different site?</w:t>
+        <w:t>Q: Can I transfer my Pro licence to a different site?</w:t>
       </w:r>
     </w:p>
     <w:p>
@@ -11264,7 +11243,7 @@
           <w:sz w:val="22"/>
           <w:szCs w:val="22"/>
         </w:rPr>
-        <w:t xml:space="preserve">Yes. First deactivate the licence on the current site via ERT Appointment → Pro Licence → Remove Activation, then activate the same key on the new site. Depending on your plan you may have 1, 3, or unlimited sites active at the same time.</w:t>
+        <w:t>Yes. First deactivate the licence on the current site via ERT Appointment → Pro Licence → Remove Activation, then activate the same key on the new site. Depending on your plan you may have 1, 3, or unlimited sites active at the same time.</w:t>
       </w:r>
     </w:p>
     <w:p>
@@ -11281,7 +11260,7 @@
           <w:sz w:val="24"/>
           <w:szCs w:val="24"/>
         </w:rPr>
-        <w:t xml:space="preserve">Q: Will I lose my data when my Pro licence expires?</w:t>
+        <w:t>Q: Will I lose my data when my Pro licence expires?</w:t>
       </w:r>
     </w:p>
     <w:p>
@@ -11295,7 +11274,7 @@
           <w:sz w:val="22"/>
           <w:szCs w:val="22"/>
         </w:rPr>
-        <w:t xml:space="preserve">No. When the licence expires, Pro features are disabled, but all appointment data remains safely stored in your database. The Lite plugin continues to operate normally.</w:t>
+        <w:t>No. When the licence expires, Pro features are disabled, but all appointment data remains safely stored in your database. The Lite plugin continues to operate normally.</w:t>
       </w:r>
     </w:p>
     <w:p>
@@ -11312,7 +11291,7 @@
           <w:sz w:val="30"/>
           <w:szCs w:val="30"/>
         </w:rPr>
-        <w:t xml:space="preserve">10.2  Enabling Debug Logging</w:t>
+        <w:t>10.2  Enabling Debug Logging</w:t>
       </w:r>
     </w:p>
     <w:p>
@@ -11326,7 +11305,7 @@
           <w:sz w:val="22"/>
           <w:szCs w:val="22"/>
         </w:rPr>
-        <w:t xml:space="preserve">Add the following to wp-config.php to capture diagnostic information:</w:t>
+        <w:t>Add the following to wp-config.php to capture diagnostic information:</w:t>
       </w:r>
     </w:p>
     <w:p>
@@ -11341,7 +11320,7 @@
           <w:sz w:val="19"/>
           <w:szCs w:val="19"/>
         </w:rPr>
-        <w:t xml:space="preserve">define( 'WP_DEBUG',         true );</w:t>
+        <w:t>define( 'WP_DEBUG',         true );</w:t>
       </w:r>
     </w:p>
     <w:p>
@@ -11356,7 +11335,7 @@
           <w:sz w:val="19"/>
           <w:szCs w:val="19"/>
         </w:rPr>
-        <w:t xml:space="preserve">define( 'WP_DEBUG_LOG',     true );</w:t>
+        <w:t>define( 'WP_DEBUG_LOG',     true );</w:t>
       </w:r>
     </w:p>
     <w:p>
@@ -11371,7 +11350,7 @@
           <w:sz w:val="19"/>
           <w:szCs w:val="19"/>
         </w:rPr>
-        <w:t xml:space="preserve">define( 'WP_DEBUG_DISPLAY', false );</w:t>
+        <w:t>define( 'WP_DEBUG_DISPLAY', false );</w:t>
       </w:r>
     </w:p>
     <w:p>
@@ -11385,7 +11364,7 @@
           <w:sz w:val="22"/>
           <w:szCs w:val="22"/>
         </w:rPr>
-        <w:t xml:space="preserve">Logs are written to wp-content/debug.log.</w:t>
+        <w:t>Logs are written to wp-content/debug.log.</w:t>
       </w:r>
     </w:p>
     <w:p>
@@ -11402,7 +11381,7 @@
           <w:sz w:val="30"/>
           <w:szCs w:val="30"/>
         </w:rPr>
-        <w:t xml:space="preserve">10.3  Support Channels</w:t>
+        <w:t>10.3  Support Channels</w:t>
       </w:r>
     </w:p>
     <w:tbl>
@@ -11452,7 +11431,7 @@
                 <w:sz w:val="20"/>
                 <w:szCs w:val="20"/>
               </w:rPr>
-              <w:t xml:space="preserve">Website</w:t>
+              <w:t>Website</w:t>
             </w:r>
           </w:p>
         </w:tc>
@@ -11484,7 +11463,7 @@
                 <w:sz w:val="20"/>
                 <w:szCs w:val="20"/>
               </w:rPr>
-              <w:t xml:space="preserve">www.ertyazilim.com</w:t>
+              <w:t>www.ertyazilim.com</w:t>
             </w:r>
           </w:p>
         </w:tc>
@@ -11520,7 +11499,7 @@
                 <w:sz w:val="20"/>
                 <w:szCs w:val="20"/>
               </w:rPr>
-              <w:t xml:space="preserve">Email Support</w:t>
+              <w:t>Email Support</w:t>
             </w:r>
           </w:p>
         </w:tc>
@@ -11552,7 +11531,7 @@
                 <w:sz w:val="20"/>
                 <w:szCs w:val="20"/>
               </w:rPr>
-              <w:t xml:space="preserve">support@ertyazilim.com</w:t>
+              <w:t>support@ertyazilim.com</w:t>
             </w:r>
           </w:p>
         </w:tc>
@@ -11588,7 +11567,7 @@
                 <w:sz w:val="20"/>
                 <w:szCs w:val="20"/>
               </w:rPr>
-              <w:t xml:space="preserve">Documentation</w:t>
+              <w:t>Documentation</w:t>
             </w:r>
           </w:p>
         </w:tc>
@@ -11620,7 +11599,7 @@
                 <w:sz w:val="20"/>
                 <w:szCs w:val="20"/>
               </w:rPr>
-              <w:t xml:space="preserve">www.ertyazilim.com/docs</w:t>
+              <w:t>www.ertyazilim.com/docs</w:t>
             </w:r>
           </w:p>
         </w:tc>
@@ -11656,7 +11635,7 @@
                 <w:sz w:val="20"/>
                 <w:szCs w:val="20"/>
               </w:rPr>
-              <w:t xml:space="preserve">WordPress.org</w:t>
+              <w:t>WordPress.org</w:t>
             </w:r>
           </w:p>
         </w:tc>
@@ -11688,7 +11667,7 @@
                 <w:sz w:val="20"/>
                 <w:szCs w:val="20"/>
               </w:rPr>
-              <w:t xml:space="preserve">wordpress.org/plugins/ert-appointment/</w:t>
+              <w:t>wordpress.org/plugins/ert-appointment/</w:t>
             </w:r>
           </w:p>
         </w:tc>
@@ -11724,7 +11703,7 @@
                 <w:sz w:val="20"/>
                 <w:szCs w:val="20"/>
               </w:rPr>
-              <w:t xml:space="preserve">GitHub</w:t>
+              <w:t>GitHub</w:t>
             </w:r>
           </w:p>
         </w:tc>
@@ -11756,7 +11735,7 @@
                 <w:sz w:val="20"/>
                 <w:szCs w:val="20"/>
               </w:rPr>
-              <w:t xml:space="preserve">github.com/ert-yazilim/ert-appointment</w:t>
+              <w:t>github.com/ert-yazilim/ert-appointment</w:t>
             </w:r>
           </w:p>
         </w:tc>
@@ -11782,7 +11761,7 @@
           <w:sz w:val="20"/>
           <w:szCs w:val="20"/>
         </w:rPr>
-        <w:t xml:space="preserve">This document was prepared by ERT Software.</w:t>
+        <w:t>This document was prepared by ERT Software.</w:t>
       </w:r>
     </w:p>
     <w:p>
@@ -11798,7 +11777,7 @@
           <w:sz w:val="22"/>
           <w:szCs w:val="22"/>
         </w:rPr>
-        <w:t xml:space="preserve">www.ertyazilim.com</w:t>
+        <w:t>www.ertyazilim.com</w:t>
       </w:r>
     </w:p>
     <w:p>
@@ -11813,7 +11792,42 @@
           <w:sz w:val="20"/>
           <w:szCs w:val="20"/>
         </w:rPr>
-        <w:t xml:space="preserve">© 2025 ERT Software — All rights reserved.</w:t>
+        <w:t>© 2025 ERT Software — All rights reserved.</w:t>
+      </w:r>
+    </w:p>
+    <w:p>
+      <w:r>
+        <w:br w:type="page"/>
+      </w:r>
+    </w:p>
+    <w:p>
+      <w:r>
+        <w:t>v1.0.1 Update Notes (Theme Preserved)</w:t>
+      </w:r>
+    </w:p>
+    <w:p>
+      <w:r>
+        <w:t>Mode-based booking flow: general, department_no_provider, department_with_provider, provider_only.</w:t>
+      </w:r>
+    </w:p>
+    <w:p>
+      <w:r>
+        <w:t>Per-form Booking Button Text override support added.</w:t>
+      </w:r>
+    </w:p>
+    <w:p>
+      <w:r>
+        <w:t>Notification channel model expanded: Lite email, Pro sms/whatsapp.</w:t>
+      </w:r>
+    </w:p>
+    <w:p>
+      <w:r>
+        <w:t>Pro WhatsApp provider (Meta Cloud API) and SMS providers (Twilio/NetGSM) supported.</w:t>
+      </w:r>
+    </w:p>
+    <w:p>
+      <w:r>
+        <w:t>WP.org release, SVN publish and assets documentation added.</w:t>
       </w:r>
     </w:p>
     <w:sectPr>

</xml_diff>